<commit_message>
Regenerate project journey DOCX and PDF
</commit_message>
<xml_diff>
--- a/docs/SmartPot_Project_Journey.docx
+++ b/docs/SmartPot_Project_Journey.docx
@@ -450,6 +450,7 @@
     </w:p>
     <w:p>
       <w:pPr>
+        <w:keepNext/>
         <w:spacing w:before="60" w:after="0" w:line="240" w:lineRule="auto"/>
         <w:rPr>
           <w:sz w:val="8"/>
@@ -2110,6 +2111,7 @@
     </w:p>
     <w:p>
       <w:pPr>
+        <w:keepNext/>
         <w:spacing w:before="60" w:after="0" w:line="240" w:lineRule="auto"/>
         <w:rPr>
           <w:sz w:val="8"/>
@@ -2489,6 +2491,7 @@
     </w:p>
     <w:p>
       <w:pPr>
+        <w:keepNext/>
         <w:spacing w:before="60" w:after="0" w:line="240" w:lineRule="auto"/>
         <w:rPr>
           <w:sz w:val="8"/>
@@ -3022,6 +3025,7 @@
     </w:p>
     <w:p>
       <w:pPr>
+        <w:keepNext/>
         <w:spacing w:before="60" w:after="0" w:line="240" w:lineRule="auto"/>
         <w:rPr>
           <w:sz w:val="8"/>
@@ -3585,6 +3589,7 @@
     </w:p>
     <w:p>
       <w:pPr>
+        <w:keepNext/>
         <w:spacing w:before="60" w:after="0" w:line="240" w:lineRule="auto"/>
         <w:rPr>
           <w:sz w:val="8"/>
@@ -4058,6 +4063,7 @@
     </w:p>
     <w:p>
       <w:pPr>
+        <w:keepNext/>
         <w:spacing w:before="60" w:after="0" w:line="240" w:lineRule="auto"/>
         <w:rPr>
           <w:sz w:val="8"/>
@@ -4600,6 +4606,7 @@
     </w:p>
     <w:p>
       <w:pPr>
+        <w:keepNext/>
         <w:spacing w:before="60" w:after="0" w:line="240" w:lineRule="auto"/>
         <w:rPr>
           <w:sz w:val="8"/>
@@ -6090,6 +6097,7 @@
     </w:p>
     <w:p>
       <w:pPr>
+        <w:keepNext/>
         <w:spacing w:before="60" w:after="0" w:line="240" w:lineRule="auto"/>
         <w:rPr>
           <w:sz w:val="8"/>
@@ -6682,6 +6690,7 @@
     </w:p>
     <w:p>
       <w:pPr>
+        <w:keepNext/>
         <w:spacing w:before="60" w:after="0" w:line="240" w:lineRule="auto"/>
         <w:rPr>
           <w:sz w:val="8"/>
@@ -7274,6 +7283,7 @@
     </w:p>
     <w:p>
       <w:pPr>
+        <w:keepNext/>
         <w:spacing w:before="60" w:after="0" w:line="240" w:lineRule="auto"/>
         <w:rPr>
           <w:sz w:val="8"/>
@@ -8272,6 +8282,7 @@
     </w:p>
     <w:p>
       <w:pPr>
+        <w:keepNext/>
         <w:spacing w:before="60" w:after="0" w:line="240" w:lineRule="auto"/>
         <w:rPr>
           <w:sz w:val="8"/>
@@ -9893,6 +9904,7 @@
     </w:p>
     <w:p>
       <w:pPr>
+        <w:keepNext/>
         <w:spacing w:before="60" w:after="0" w:line="240" w:lineRule="auto"/>
         <w:rPr>
           <w:sz w:val="8"/>
@@ -10652,6 +10664,7 @@
     </w:p>
     <w:p>
       <w:pPr>
+        <w:keepNext/>
         <w:spacing w:before="60" w:after="0" w:line="240" w:lineRule="auto"/>
         <w:rPr>
           <w:sz w:val="8"/>
@@ -11869,6 +11882,7 @@
     </w:p>
     <w:p>
       <w:pPr>
+        <w:keepNext/>
         <w:spacing w:before="60" w:after="0" w:line="240" w:lineRule="auto"/>
         <w:rPr>
           <w:sz w:val="8"/>
@@ -12667,6 +12681,7 @@
     </w:p>
     <w:p>
       <w:pPr>
+        <w:keepNext/>
         <w:spacing w:before="60" w:after="0" w:line="240" w:lineRule="auto"/>
         <w:rPr>
           <w:sz w:val="8"/>
@@ -14623,6 +14638,7 @@
     </w:p>
     <w:p>
       <w:pPr>
+        <w:keepNext/>
         <w:spacing w:before="60" w:after="0" w:line="240" w:lineRule="auto"/>
         <w:rPr>
           <w:sz w:val="8"/>
@@ -15001,6 +15017,7 @@
     </w:p>
     <w:p>
       <w:pPr>
+        <w:keepNext/>
         <w:spacing w:before="60" w:after="0" w:line="240" w:lineRule="auto"/>
         <w:rPr>
           <w:sz w:val="8"/>
@@ -15678,6 +15695,7 @@
     </w:p>
     <w:p>
       <w:pPr>
+        <w:keepNext/>
         <w:spacing w:before="60" w:after="0" w:line="240" w:lineRule="auto"/>
         <w:rPr>
           <w:sz w:val="8"/>
@@ -16051,6 +16069,7 @@
     </w:p>
     <w:p>
       <w:pPr>
+        <w:keepNext/>
         <w:spacing w:before="60" w:after="0" w:line="240" w:lineRule="auto"/>
         <w:rPr>
           <w:sz w:val="8"/>
@@ -17256,6 +17275,7 @@
     </w:p>
     <w:p>
       <w:pPr>
+        <w:keepNext/>
         <w:spacing w:before="60" w:after="0" w:line="240" w:lineRule="auto"/>
         <w:rPr>
           <w:sz w:val="8"/>
@@ -17870,7 +17890,7 @@
           <w:sz w:val="20"/>
           <w:szCs w:val="20"/>
         </w:rPr>
-        <w:t xml:space="preserve">Cada servicio publica su imagen en GHCR (y en Docker Hub como réplica) con SBOM y atestación de procedencia, y pide el despliegue al workflow central, que corre de a uno: si llegan varios pedidos a la vez, solo el más reciente espera. El servidor descarga las imágenes desde GHCR y recrea solo lo que cambió.</w:t>
+        <w:t xml:space="preserve">Cada servicio publica su imagen en GHCR (y en Docker Hub como réplica) con SBOM y atestación de procedencia, y pide el despliegue al workflow central, que corre de a uno: si llegan varios pedidos a la vez, solo el más reciente espera. El servidor descarga las imágenes desde GHCR, recrea solo lo que cambió y aplica los esquemas de la base con la migración de SmartPot-DB.</w:t>
       </w:r>
     </w:p>
     <w:p>
@@ -18315,6 +18335,7 @@
     </w:p>
     <w:p>
       <w:pPr>
+        <w:keepNext/>
         <w:spacing w:before="60" w:after="0" w:line="240" w:lineRule="auto"/>
         <w:rPr>
           <w:sz w:val="8"/>
@@ -19086,6 +19107,7 @@
     </w:p>
     <w:p>
       <w:pPr>
+        <w:keepNext/>
         <w:spacing w:before="60" w:after="0" w:line="240" w:lineRule="auto"/>
         <w:rPr>
           <w:sz w:val="8"/>
@@ -19691,6 +19713,7 @@
     </w:p>
     <w:p>
       <w:pPr>
+        <w:keepNext/>
         <w:spacing w:before="60" w:after="0" w:line="240" w:lineRule="auto"/>
         <w:rPr>
           <w:sz w:val="8"/>
@@ -20473,6 +20496,7 @@
     </w:p>
     <w:p>
       <w:pPr>
+        <w:keepNext/>
         <w:spacing w:before="60" w:after="0" w:line="240" w:lineRule="auto"/>
         <w:rPr>
           <w:sz w:val="8"/>
@@ -21200,6 +21224,7 @@
     </w:p>
     <w:p>
       <w:pPr>
+        <w:keepNext/>
         <w:spacing w:before="60" w:after="0" w:line="240" w:lineRule="auto"/>
         <w:rPr>
           <w:sz w:val="8"/>
@@ -21868,6 +21893,7 @@
     </w:p>
     <w:p>
       <w:pPr>
+        <w:keepNext/>
         <w:spacing w:before="60" w:after="0" w:line="240" w:lineRule="auto"/>
         <w:rPr>
           <w:sz w:val="8"/>

</xml_diff>

<commit_message>
Regenerate the project journey DOCX and PDF
</commit_message>
<xml_diff>
--- a/docs/SmartPot_Project_Journey.docx
+++ b/docs/SmartPot_Project_Journey.docx
@@ -1583,7 +1583,7 @@
             <w:sz w:val="18"/>
             <w:szCs w:val="18"/>
           </w:rPr>
-          <w:t xml:space="preserve">14.5 Simulación: Wokwi y macetas virtuales</w:t>
+          <w:t xml:space="preserve">14.5 Simulación: Wokwi y cultivos virtuales</w:t>
         </w:r>
       </w:hyperlink>
     </w:p>
@@ -2517,8 +2517,8 @@
         <w:tblLook w:val="04A0" w:firstRow="1" w:firstColumn="1" w:noVBand="1"/>
       </w:tblPr>
       <w:tblGrid>
-        <w:gridCol w:w="3982"/>
-        <w:gridCol w:w="5378"/>
+        <w:gridCol w:w="3850"/>
+        <w:gridCol w:w="5510"/>
       </w:tblGrid>
       <w:tr>
         <w:trPr>
@@ -2527,7 +2527,7 @@
         </w:trPr>
         <w:tc>
           <w:tcPr>
-            <w:tcW w:w="3982" w:type="dxa"/>
+            <w:tcW w:w="3850" w:type="dxa"/>
             <w:shd w:val="clear" w:color="auto" w:fill="0B3D2B"/>
             <w:tcMar>
               <w:top w:w="70" w:type="dxa"/>
@@ -2556,7 +2556,7 @@
         </w:tc>
         <w:tc>
           <w:tcPr>
-            <w:tcW w:w="5378" w:type="dxa"/>
+            <w:tcW w:w="5510" w:type="dxa"/>
             <w:shd w:val="clear" w:color="auto" w:fill="0B3D2B"/>
             <w:tcMar>
               <w:top w:w="70" w:type="dxa"/>
@@ -2590,7 +2590,7 @@
         </w:trPr>
         <w:tc>
           <w:tcPr>
-            <w:tcW w:w="3982" w:type="dxa"/>
+            <w:tcW w:w="3850" w:type="dxa"/>
             <w:shd w:val="clear" w:color="auto" w:fill="FFFFFF"/>
             <w:tcMar>
               <w:top w:w="70" w:type="dxa"/>
@@ -2618,7 +2618,7 @@
         </w:tc>
         <w:tc>
           <w:tcPr>
-            <w:tcW w:w="5378" w:type="dxa"/>
+            <w:tcW w:w="5510" w:type="dxa"/>
             <w:shd w:val="clear" w:color="auto" w:fill="FFFFFF"/>
             <w:tcMar>
               <w:top w:w="70" w:type="dxa"/>
@@ -2649,7 +2649,7 @@
         </w:trPr>
         <w:tc>
           <w:tcPr>
-            <w:tcW w:w="3982" w:type="dxa"/>
+            <w:tcW w:w="3850" w:type="dxa"/>
             <w:shd w:val="clear" w:color="auto" w:fill="F2F7F4"/>
             <w:tcMar>
               <w:top w:w="70" w:type="dxa"/>
@@ -2677,7 +2677,7 @@
         </w:tc>
         <w:tc>
           <w:tcPr>
-            <w:tcW w:w="5378" w:type="dxa"/>
+            <w:tcW w:w="5510" w:type="dxa"/>
             <w:shd w:val="clear" w:color="auto" w:fill="F2F7F4"/>
             <w:tcMar>
               <w:top w:w="70" w:type="dxa"/>
@@ -2708,7 +2708,7 @@
         </w:trPr>
         <w:tc>
           <w:tcPr>
-            <w:tcW w:w="3982" w:type="dxa"/>
+            <w:tcW w:w="3850" w:type="dxa"/>
             <w:shd w:val="clear" w:color="auto" w:fill="FFFFFF"/>
             <w:tcMar>
               <w:top w:w="70" w:type="dxa"/>
@@ -2736,7 +2736,7 @@
         </w:tc>
         <w:tc>
           <w:tcPr>
-            <w:tcW w:w="5378" w:type="dxa"/>
+            <w:tcW w:w="5510" w:type="dxa"/>
             <w:shd w:val="clear" w:color="auto" w:fill="FFFFFF"/>
             <w:tcMar>
               <w:top w:w="70" w:type="dxa"/>
@@ -2767,7 +2767,7 @@
         </w:trPr>
         <w:tc>
           <w:tcPr>
-            <w:tcW w:w="3982" w:type="dxa"/>
+            <w:tcW w:w="3850" w:type="dxa"/>
             <w:shd w:val="clear" w:color="auto" w:fill="F2F7F4"/>
             <w:tcMar>
               <w:top w:w="70" w:type="dxa"/>
@@ -2795,7 +2795,7 @@
         </w:tc>
         <w:tc>
           <w:tcPr>
-            <w:tcW w:w="5378" w:type="dxa"/>
+            <w:tcW w:w="5510" w:type="dxa"/>
             <w:shd w:val="clear" w:color="auto" w:fill="F2F7F4"/>
             <w:tcMar>
               <w:top w:w="70" w:type="dxa"/>
@@ -2826,7 +2826,7 @@
         </w:trPr>
         <w:tc>
           <w:tcPr>
-            <w:tcW w:w="3982" w:type="dxa"/>
+            <w:tcW w:w="3850" w:type="dxa"/>
             <w:shd w:val="clear" w:color="auto" w:fill="FFFFFF"/>
             <w:tcMar>
               <w:top w:w="70" w:type="dxa"/>
@@ -2854,7 +2854,7 @@
         </w:tc>
         <w:tc>
           <w:tcPr>
-            <w:tcW w:w="5378" w:type="dxa"/>
+            <w:tcW w:w="5510" w:type="dxa"/>
             <w:shd w:val="clear" w:color="auto" w:fill="FFFFFF"/>
             <w:tcMar>
               <w:top w:w="70" w:type="dxa"/>
@@ -2885,7 +2885,7 @@
         </w:trPr>
         <w:tc>
           <w:tcPr>
-            <w:tcW w:w="3982" w:type="dxa"/>
+            <w:tcW w:w="3850" w:type="dxa"/>
             <w:shd w:val="clear" w:color="auto" w:fill="F2F7F4"/>
             <w:tcMar>
               <w:top w:w="70" w:type="dxa"/>
@@ -2913,27 +2913,27 @@
         </w:tc>
         <w:tc>
           <w:tcPr>
-            <w:tcW w:w="5378" w:type="dxa"/>
-            <w:shd w:val="clear" w:color="auto" w:fill="F2F7F4"/>
-            <w:tcMar>
-              <w:top w:w="70" w:type="dxa"/>
-              <w:left w:w="110" w:type="dxa"/>
-              <w:bottom w:w="70" w:type="dxa"/>
-              <w:right w:w="110" w:type="dxa"/>
-            </w:tcMar>
-            <w:vAlign w:val="center"/>
-          </w:tcPr>
-          <w:p>
-            <w:pPr>
-              <w:spacing w:before="0" w:after="0" w:line="252" w:lineRule="auto"/>
-            </w:pPr>
-            <w:r>
-              <w:rPr>
-                <w:color w:val="17261F"/>
-                <w:sz w:val="17"/>
-                <w:szCs w:val="17"/>
-              </w:rPr>
-              <w:t xml:space="preserve">Seis especies, macetas físicas o virtuales y clima real del lugar</w:t>
+            <w:tcW w:w="5510" w:type="dxa"/>
+            <w:shd w:val="clear" w:color="auto" w:fill="F2F7F4"/>
+            <w:tcMar>
+              <w:top w:w="70" w:type="dxa"/>
+              <w:left w:w="110" w:type="dxa"/>
+              <w:bottom w:w="70" w:type="dxa"/>
+              <w:right w:w="110" w:type="dxa"/>
+            </w:tcMar>
+            <w:vAlign w:val="center"/>
+          </w:tcPr>
+          <w:p>
+            <w:pPr>
+              <w:spacing w:before="0" w:after="0" w:line="252" w:lineRule="auto"/>
+            </w:pPr>
+            <w:r>
+              <w:rPr>
+                <w:color w:val="17261F"/>
+                <w:sz w:val="17"/>
+                <w:szCs w:val="17"/>
+              </w:rPr>
+              <w:t xml:space="preserve">Seis especies, cuatro formas (maceta, tubos NFT, torre o balsa), cultivos reales o virtuales y clima real del lugar</w:t>
             </w:r>
           </w:p>
         </w:tc>
@@ -2944,7 +2944,7 @@
         </w:trPr>
         <w:tc>
           <w:tcPr>
-            <w:tcW w:w="3982" w:type="dxa"/>
+            <w:tcW w:w="3850" w:type="dxa"/>
             <w:shd w:val="clear" w:color="auto" w:fill="FFFFFF"/>
             <w:tcMar>
               <w:top w:w="70" w:type="dxa"/>
@@ -2972,7 +2972,7 @@
         </w:tc>
         <w:tc>
           <w:tcPr>
-            <w:tcW w:w="5378" w:type="dxa"/>
+            <w:tcW w:w="5510" w:type="dxa"/>
             <w:shd w:val="clear" w:color="auto" w:fill="FFFFFF"/>
             <w:tcMar>
               <w:top w:w="70" w:type="dxa"/>
@@ -6123,8 +6123,8 @@
         <w:tblLook w:val="04A0" w:firstRow="1" w:firstColumn="1" w:noVBand="1"/>
       </w:tblPr>
       <w:tblGrid>
-        <w:gridCol w:w="2715"/>
-        <w:gridCol w:w="6645"/>
+        <w:gridCol w:w="2586"/>
+        <w:gridCol w:w="6774"/>
       </w:tblGrid>
       <w:tr>
         <w:trPr>
@@ -6133,7 +6133,7 @@
         </w:trPr>
         <w:tc>
           <w:tcPr>
-            <w:tcW w:w="2715" w:type="dxa"/>
+            <w:tcW w:w="2586" w:type="dxa"/>
             <w:shd w:val="clear" w:color="auto" w:fill="0B3D2B"/>
             <w:tcMar>
               <w:top w:w="70" w:type="dxa"/>
@@ -6162,7 +6162,7 @@
         </w:tc>
         <w:tc>
           <w:tcPr>
-            <w:tcW w:w="6645" w:type="dxa"/>
+            <w:tcW w:w="6774" w:type="dxa"/>
             <w:shd w:val="clear" w:color="auto" w:fill="0B3D2B"/>
             <w:tcMar>
               <w:top w:w="70" w:type="dxa"/>
@@ -6196,7 +6196,7 @@
         </w:trPr>
         <w:tc>
           <w:tcPr>
-            <w:tcW w:w="2715" w:type="dxa"/>
+            <w:tcW w:w="2586" w:type="dxa"/>
             <w:shd w:val="clear" w:color="auto" w:fill="FFFFFF"/>
             <w:tcMar>
               <w:top w:w="70" w:type="dxa"/>
@@ -6224,7 +6224,7 @@
         </w:tc>
         <w:tc>
           <w:tcPr>
-            <w:tcW w:w="6645" w:type="dxa"/>
+            <w:tcW w:w="6774" w:type="dxa"/>
             <w:shd w:val="clear" w:color="auto" w:fill="FFFFFF"/>
             <w:tcMar>
               <w:top w:w="70" w:type="dxa"/>
@@ -6255,7 +6255,7 @@
         </w:trPr>
         <w:tc>
           <w:tcPr>
-            <w:tcW w:w="2715" w:type="dxa"/>
+            <w:tcW w:w="2586" w:type="dxa"/>
             <w:shd w:val="clear" w:color="auto" w:fill="F2F7F4"/>
             <w:tcMar>
               <w:top w:w="70" w:type="dxa"/>
@@ -6283,7 +6283,7 @@
         </w:tc>
         <w:tc>
           <w:tcPr>
-            <w:tcW w:w="6645" w:type="dxa"/>
+            <w:tcW w:w="6774" w:type="dxa"/>
             <w:shd w:val="clear" w:color="auto" w:fill="F2F7F4"/>
             <w:tcMar>
               <w:top w:w="70" w:type="dxa"/>
@@ -6314,7 +6314,7 @@
         </w:trPr>
         <w:tc>
           <w:tcPr>
-            <w:tcW w:w="2715" w:type="dxa"/>
+            <w:tcW w:w="2586" w:type="dxa"/>
             <w:shd w:val="clear" w:color="auto" w:fill="FFFFFF"/>
             <w:tcMar>
               <w:top w:w="70" w:type="dxa"/>
@@ -6342,27 +6342,27 @@
         </w:tc>
         <w:tc>
           <w:tcPr>
-            <w:tcW w:w="6645" w:type="dxa"/>
-            <w:shd w:val="clear" w:color="auto" w:fill="FFFFFF"/>
-            <w:tcMar>
-              <w:top w:w="70" w:type="dxa"/>
-              <w:left w:w="110" w:type="dxa"/>
-              <w:bottom w:w="70" w:type="dxa"/>
-              <w:right w:w="110" w:type="dxa"/>
-            </w:tcMar>
-            <w:vAlign w:val="center"/>
-          </w:tcPr>
-          <w:p>
-            <w:pPr>
-              <w:spacing w:before="0" w:after="0" w:line="252" w:lineRule="auto"/>
-            </w:pPr>
-            <w:r>
-              <w:rPr>
-                <w:color w:val="17261F"/>
-                <w:sz w:val="17"/>
-                <w:szCs w:val="17"/>
-              </w:rPr>
-              <w:t xml:space="preserve">Firmware MicroPython en Wokwi y macetas virtuales siempre encendidas</w:t>
+            <w:tcW w:w="6774" w:type="dxa"/>
+            <w:shd w:val="clear" w:color="auto" w:fill="FFFFFF"/>
+            <w:tcMar>
+              <w:top w:w="70" w:type="dxa"/>
+              <w:left w:w="110" w:type="dxa"/>
+              <w:bottom w:w="70" w:type="dxa"/>
+              <w:right w:w="110" w:type="dxa"/>
+            </w:tcMar>
+            <w:vAlign w:val="center"/>
+          </w:tcPr>
+          <w:p>
+            <w:pPr>
+              <w:spacing w:before="0" w:after="0" w:line="252" w:lineRule="auto"/>
+            </w:pPr>
+            <w:r>
+              <w:rPr>
+                <w:color w:val="17261F"/>
+                <w:sz w:val="17"/>
+                <w:szCs w:val="17"/>
+              </w:rPr>
+              <w:t xml:space="preserve">Firmware MicroPython en Wokwi (un cultivo real) y cultivos virtuales siempre encendidos</w:t>
             </w:r>
           </w:p>
         </w:tc>
@@ -6373,7 +6373,7 @@
         </w:trPr>
         <w:tc>
           <w:tcPr>
-            <w:tcW w:w="2715" w:type="dxa"/>
+            <w:tcW w:w="2586" w:type="dxa"/>
             <w:shd w:val="clear" w:color="auto" w:fill="F2F7F4"/>
             <w:tcMar>
               <w:top w:w="70" w:type="dxa"/>
@@ -6401,7 +6401,7 @@
         </w:tc>
         <w:tc>
           <w:tcPr>
-            <w:tcW w:w="6645" w:type="dxa"/>
+            <w:tcW w:w="6774" w:type="dxa"/>
             <w:shd w:val="clear" w:color="auto" w:fill="F2F7F4"/>
             <w:tcMar>
               <w:top w:w="70" w:type="dxa"/>
@@ -6432,7 +6432,7 @@
         </w:trPr>
         <w:tc>
           <w:tcPr>
-            <w:tcW w:w="2715" w:type="dxa"/>
+            <w:tcW w:w="2586" w:type="dxa"/>
             <w:shd w:val="clear" w:color="auto" w:fill="FFFFFF"/>
             <w:tcMar>
               <w:top w:w="70" w:type="dxa"/>
@@ -6460,7 +6460,7 @@
         </w:tc>
         <w:tc>
           <w:tcPr>
-            <w:tcW w:w="6645" w:type="dxa"/>
+            <w:tcW w:w="6774" w:type="dxa"/>
             <w:shd w:val="clear" w:color="auto" w:fill="FFFFFF"/>
             <w:tcMar>
               <w:top w:w="70" w:type="dxa"/>
@@ -6491,7 +6491,7 @@
         </w:trPr>
         <w:tc>
           <w:tcPr>
-            <w:tcW w:w="2715" w:type="dxa"/>
+            <w:tcW w:w="2586" w:type="dxa"/>
             <w:shd w:val="clear" w:color="auto" w:fill="F2F7F4"/>
             <w:tcMar>
               <w:top w:w="70" w:type="dxa"/>
@@ -6519,7 +6519,7 @@
         </w:tc>
         <w:tc>
           <w:tcPr>
-            <w:tcW w:w="6645" w:type="dxa"/>
+            <w:tcW w:w="6774" w:type="dxa"/>
             <w:shd w:val="clear" w:color="auto" w:fill="F2F7F4"/>
             <w:tcMar>
               <w:top w:w="70" w:type="dxa"/>
@@ -6550,7 +6550,7 @@
         </w:trPr>
         <w:tc>
           <w:tcPr>
-            <w:tcW w:w="2715" w:type="dxa"/>
+            <w:tcW w:w="2586" w:type="dxa"/>
             <w:shd w:val="clear" w:color="auto" w:fill="FFFFFF"/>
             <w:tcMar>
               <w:top w:w="70" w:type="dxa"/>
@@ -6578,7 +6578,7 @@
         </w:tc>
         <w:tc>
           <w:tcPr>
-            <w:tcW w:w="6645" w:type="dxa"/>
+            <w:tcW w:w="6774" w:type="dxa"/>
             <w:shd w:val="clear" w:color="auto" w:fill="FFFFFF"/>
             <w:tcMar>
               <w:top w:w="70" w:type="dxa"/>
@@ -6609,7 +6609,7 @@
         </w:trPr>
         <w:tc>
           <w:tcPr>
-            <w:tcW w:w="2715" w:type="dxa"/>
+            <w:tcW w:w="2586" w:type="dxa"/>
             <w:shd w:val="clear" w:color="auto" w:fill="F2F7F4"/>
             <w:tcMar>
               <w:top w:w="70" w:type="dxa"/>
@@ -6637,7 +6637,7 @@
         </w:tc>
         <w:tc>
           <w:tcPr>
-            <w:tcW w:w="6645" w:type="dxa"/>
+            <w:tcW w:w="6774" w:type="dxa"/>
             <w:shd w:val="clear" w:color="auto" w:fill="F2F7F4"/>
             <w:tcMar>
               <w:top w:w="70" w:type="dxa"/>
@@ -7571,7 +7571,7 @@
                 <w:sz w:val="17"/>
                 <w:szCs w:val="17"/>
               </w:rPr>
-              <w:t xml:space="preserve">El alcance creció (IA, panel general, macetas virtuales, Telegram) sin romper lo existente gracias a la separación por componentes</w:t>
+              <w:t xml:space="preserve">El alcance creció (IA, panel general, cultivos virtuales, Telegram, cultivo en vivo) sin romper lo existente gracias a la separación por componentes</w:t>
             </w:r>
           </w:p>
         </w:tc>
@@ -7911,7 +7911,7 @@
                 <w:sz w:val="17"/>
                 <w:szCs w:val="17"/>
               </w:rPr>
-              <w:t xml:space="preserve">Se encontraron y corrigieron rutas sin control de dueño; cuenta MQTT por maceta, cifrado AES-GCM de claves, límite de peticiones y CodeQL</w:t>
+              <w:t xml:space="preserve">Se encontraron y corrigieron rutas sin control de dueño; cuenta MQTT por cultivo, cifrado AES-GCM de claves, límite de peticiones y CodeQL</w:t>
             </w:r>
           </w:p>
         </w:tc>
@@ -8570,7 +8570,7 @@
                 <w:sz w:val="17"/>
                 <w:szCs w:val="17"/>
               </w:rPr>
-              <w:t xml:space="preserve">La escala de cada sensor se ajusta en el firmware; la PWA administra los actuadores y la clave de la maceta. La calibración remota queda pendiente</w:t>
+              <w:t xml:space="preserve">La escala de cada sensor se ajusta en el firmware; la PWA administra los actuadores y la clave del dispositivo. La calibración remota queda pendiente</w:t>
             </w:r>
           </w:p>
         </w:tc>
@@ -9505,7 +9505,7 @@
                 <w:sz w:val="17"/>
                 <w:szCs w:val="17"/>
               </w:rPr>
-              <w:t xml:space="preserve">Crear, editar y eliminar cultivos de seis especies, sus actuadores y su maceta</w:t>
+              <w:t xml:space="preserve">Crear, editar y eliminar cultivos de seis especies, reales o virtuales, con su forma y sus actuadores</w:t>
             </w:r>
           </w:p>
         </w:tc>
@@ -9675,7 +9675,7 @@
                 <w:sz w:val="17"/>
                 <w:szCs w:val="17"/>
               </w:rPr>
-              <w:t xml:space="preserve">Contrato MQTT v1 para las macetas y REST documentado en </w:t>
+              <w:t xml:space="preserve">Contrato MQTT v1 para los dispositivos y REST documentado en </w:t>
             </w:r>
             <w:r>
               <w:rPr>
@@ -10277,7 +10277,7 @@
                 <w:sz w:val="17"/>
                 <w:szCs w:val="17"/>
               </w:rPr>
-              <w:t xml:space="preserve">La maceta publica por MQTT y la API guarda en segundos; la PWA se actualiza cada 10 a 30 s. Un canal en vivo hacia la PWA queda como mejora</w:t>
+              <w:t xml:space="preserve">El dispositivo publica por MQTT y la API guarda en segundos; la PWA se actualiza cada 10 a 30 s. Un canal en vivo hacia la PWA queda como mejora</w:t>
             </w:r>
           </w:p>
         </w:tc>
@@ -10602,7 +10602,7 @@
       <w:r>
         <w:drawing>
           <wp:inline distT="0" distB="0" distL="0" distR="0">
-            <wp:extent cx="3076539" cy="7112000"/>
+            <wp:extent cx="3078915" cy="7112000"/>
             <wp:docPr id="124" name="SmartPot_10_Use_Cases"/>
             <wp:cNvGraphicFramePr>
               <a:graphicFrameLocks noChangeAspect="1"/>
@@ -10623,7 +10623,7 @@
                   <pic:spPr>
                     <a:xfrm>
                       <a:off x="0" y="0"/>
-                      <a:ext cx="3076539" cy="7112000"/>
+                      <a:ext cx="3078915" cy="7112000"/>
                     </a:xfrm>
                     <a:prstGeom prst="rect">
                       <a:avLst/>
@@ -10690,9 +10690,9 @@
         <w:tblLook w:val="04A0" w:firstRow="1" w:firstColumn="1" w:noVBand="1"/>
       </w:tblPr>
       <w:tblGrid>
-        <w:gridCol w:w="2375"/>
-        <w:gridCol w:w="3794"/>
-        <w:gridCol w:w="3191"/>
+        <w:gridCol w:w="2340"/>
+        <w:gridCol w:w="3569"/>
+        <w:gridCol w:w="3451"/>
       </w:tblGrid>
       <w:tr>
         <w:trPr>
@@ -10701,7 +10701,7 @@
         </w:trPr>
         <w:tc>
           <w:tcPr>
-            <w:tcW w:w="2375" w:type="dxa"/>
+            <w:tcW w:w="2340" w:type="dxa"/>
             <w:shd w:val="clear" w:color="auto" w:fill="0B3D2B"/>
             <w:tcMar>
               <w:top w:w="70" w:type="dxa"/>
@@ -10730,7 +10730,7 @@
         </w:tc>
         <w:tc>
           <w:tcPr>
-            <w:tcW w:w="3794" w:type="dxa"/>
+            <w:tcW w:w="3569" w:type="dxa"/>
             <w:shd w:val="clear" w:color="auto" w:fill="0B3D2B"/>
             <w:tcMar>
               <w:top w:w="70" w:type="dxa"/>
@@ -10759,7 +10759,7 @@
         </w:tc>
         <w:tc>
           <w:tcPr>
-            <w:tcW w:w="3191" w:type="dxa"/>
+            <w:tcW w:w="3451" w:type="dxa"/>
             <w:shd w:val="clear" w:color="auto" w:fill="0B3D2B"/>
             <w:tcMar>
               <w:top w:w="70" w:type="dxa"/>
@@ -10793,7 +10793,7 @@
         </w:trPr>
         <w:tc>
           <w:tcPr>
-            <w:tcW w:w="2375" w:type="dxa"/>
+            <w:tcW w:w="2340" w:type="dxa"/>
             <w:shd w:val="clear" w:color="auto" w:fill="FFFFFF"/>
             <w:tcMar>
               <w:top w:w="70" w:type="dxa"/>
@@ -10821,7 +10821,7 @@
         </w:tc>
         <w:tc>
           <w:tcPr>
-            <w:tcW w:w="3794" w:type="dxa"/>
+            <w:tcW w:w="3569" w:type="dxa"/>
             <w:shd w:val="clear" w:color="auto" w:fill="FFFFFF"/>
             <w:tcMar>
               <w:top w:w="70" w:type="dxa"/>
@@ -10847,7 +10847,7 @@
         </w:tc>
         <w:tc>
           <w:tcPr>
-            <w:tcW w:w="3191" w:type="dxa"/>
+            <w:tcW w:w="3451" w:type="dxa"/>
             <w:shd w:val="clear" w:color="auto" w:fill="FFFFFF"/>
             <w:tcMar>
               <w:top w:w="70" w:type="dxa"/>
@@ -10878,61 +10878,78 @@
         </w:trPr>
         <w:tc>
           <w:tcPr>
-            <w:tcW w:w="2375" w:type="dxa"/>
-            <w:shd w:val="clear" w:color="auto" w:fill="F2F7F4"/>
-            <w:tcMar>
-              <w:top w:w="70" w:type="dxa"/>
-              <w:left w:w="110" w:type="dxa"/>
-              <w:bottom w:w="70" w:type="dxa"/>
-              <w:right w:w="110" w:type="dxa"/>
-            </w:tcMar>
-            <w:vAlign w:val="center"/>
-          </w:tcPr>
-          <w:p>
-            <w:pPr>
-              <w:spacing w:before="0" w:after="0" w:line="252" w:lineRule="auto"/>
-            </w:pPr>
-            <w:r>
-              <w:rPr>
-                <w:b/>
-                <w:bCs/>
-                <w:color w:val="0A5A3C"/>
-                <w:sz w:val="17"/>
-                <w:szCs w:val="17"/>
-              </w:rPr>
-              <w:t xml:space="preserve">CU002 Conectar y calibrar la maceta</w:t>
-            </w:r>
-          </w:p>
-        </w:tc>
-        <w:tc>
-          <w:tcPr>
-            <w:tcW w:w="3794" w:type="dxa"/>
-            <w:shd w:val="clear" w:color="auto" w:fill="F2F7F4"/>
-            <w:tcMar>
-              <w:top w:w="70" w:type="dxa"/>
-              <w:left w:w="110" w:type="dxa"/>
-              <w:bottom w:w="70" w:type="dxa"/>
-              <w:right w:w="110" w:type="dxa"/>
-            </w:tcMar>
-            <w:vAlign w:val="center"/>
-          </w:tcPr>
-          <w:p>
-            <w:pPr>
-              <w:spacing w:before="0" w:after="0" w:line="252" w:lineRule="auto"/>
-            </w:pPr>
-            <w:r>
-              <w:rPr>
-                <w:color w:val="17261F"/>
-                <w:sz w:val="17"/>
-                <w:szCs w:val="17"/>
-              </w:rPr>
-              <w:t xml:space="preserve">Crear el cultivo, copiar la configuración del firmware o encender la maceta virtual</w:t>
-            </w:r>
-          </w:p>
-        </w:tc>
-        <w:tc>
-          <w:tcPr>
-            <w:tcW w:w="3191" w:type="dxa"/>
+            <w:tcW w:w="2340" w:type="dxa"/>
+            <w:shd w:val="clear" w:color="auto" w:fill="F2F7F4"/>
+            <w:tcMar>
+              <w:top w:w="70" w:type="dxa"/>
+              <w:left w:w="110" w:type="dxa"/>
+              <w:bottom w:w="70" w:type="dxa"/>
+              <w:right w:w="110" w:type="dxa"/>
+            </w:tcMar>
+            <w:vAlign w:val="center"/>
+          </w:tcPr>
+          <w:p>
+            <w:pPr>
+              <w:spacing w:before="0" w:after="0" w:line="252" w:lineRule="auto"/>
+            </w:pPr>
+            <w:r>
+              <w:rPr>
+                <w:b/>
+                <w:bCs/>
+                <w:color w:val="0A5A3C"/>
+                <w:sz w:val="17"/>
+                <w:szCs w:val="17"/>
+              </w:rPr>
+              <w:t xml:space="preserve">CU002 Conectar el dispositivo (ESP32 o Wokwi)</w:t>
+            </w:r>
+          </w:p>
+        </w:tc>
+        <w:tc>
+          <w:tcPr>
+            <w:tcW w:w="3569" w:type="dxa"/>
+            <w:shd w:val="clear" w:color="auto" w:fill="F2F7F4"/>
+            <w:tcMar>
+              <w:top w:w="70" w:type="dxa"/>
+              <w:left w:w="110" w:type="dxa"/>
+              <w:bottom w:w="70" w:type="dxa"/>
+              <w:right w:w="110" w:type="dxa"/>
+            </w:tcMar>
+            <w:vAlign w:val="center"/>
+          </w:tcPr>
+          <w:p>
+            <w:pPr>
+              <w:spacing w:before="0" w:after="0" w:line="252" w:lineRule="auto"/>
+            </w:pPr>
+            <w:r>
+              <w:rPr>
+                <w:color w:val="17261F"/>
+                <w:sz w:val="17"/>
+                <w:szCs w:val="17"/>
+              </w:rPr>
+              <w:t xml:space="preserve">Crear un cultivo real y seguir la guía: circuito, firmware y </w:t>
+            </w:r>
+            <w:r>
+              <w:rPr>
+                <w:rFonts w:ascii="JetBrains Mono" w:hAnsi="JetBrains Mono" w:eastAsia="JetBrains Mono" w:cs="JetBrains Mono"/>
+                <w:color w:val="0A5A3C"/>
+                <w:sz w:val="15"/>
+                <w:szCs w:val="15"/>
+              </w:rPr>
+              <w:t xml:space="preserve">config.py</w:t>
+            </w:r>
+            <w:r>
+              <w:rPr>
+                <w:color w:val="17261F"/>
+                <w:sz w:val="17"/>
+                <w:szCs w:val="17"/>
+              </w:rPr>
+              <w:t xml:space="preserve">, o el proyecto de Wokwi</w:t>
+            </w:r>
+          </w:p>
+        </w:tc>
+        <w:tc>
+          <w:tcPr>
+            <w:tcW w:w="3451" w:type="dxa"/>
             <w:shd w:val="clear" w:color="auto" w:fill="F2F7F4"/>
             <w:tcMar>
               <w:top w:w="70" w:type="dxa"/>
@@ -10963,81 +10980,81 @@
         </w:trPr>
         <w:tc>
           <w:tcPr>
-            <w:tcW w:w="2375" w:type="dxa"/>
-            <w:shd w:val="clear" w:color="auto" w:fill="FFFFFF"/>
-            <w:tcMar>
-              <w:top w:w="70" w:type="dxa"/>
-              <w:left w:w="110" w:type="dxa"/>
-              <w:bottom w:w="70" w:type="dxa"/>
-              <w:right w:w="110" w:type="dxa"/>
-            </w:tcMar>
-            <w:vAlign w:val="center"/>
-          </w:tcPr>
-          <w:p>
-            <w:pPr>
-              <w:spacing w:before="0" w:after="0" w:line="252" w:lineRule="auto"/>
-            </w:pPr>
-            <w:r>
-              <w:rPr>
-                <w:b/>
-                <w:bCs/>
-                <w:color w:val="0A5A3C"/>
-                <w:sz w:val="17"/>
-                <w:szCs w:val="17"/>
-              </w:rPr>
-              <w:t xml:space="preserve">CU003 Ver el estado de las plantas</w:t>
-            </w:r>
-          </w:p>
-        </w:tc>
-        <w:tc>
-          <w:tcPr>
-            <w:tcW w:w="3794" w:type="dxa"/>
-            <w:shd w:val="clear" w:color="auto" w:fill="FFFFFF"/>
-            <w:tcMar>
-              <w:top w:w="70" w:type="dxa"/>
-              <w:left w:w="110" w:type="dxa"/>
-              <w:bottom w:w="70" w:type="dxa"/>
-              <w:right w:w="110" w:type="dxa"/>
-            </w:tcMar>
-            <w:vAlign w:val="center"/>
-          </w:tcPr>
-          <w:p>
-            <w:pPr>
-              <w:spacing w:before="0" w:after="0" w:line="252" w:lineRule="auto"/>
-            </w:pPr>
-            <w:r>
-              <w:rPr>
-                <w:color w:val="17261F"/>
-                <w:sz w:val="17"/>
-                <w:szCs w:val="17"/>
-              </w:rPr>
-              <w:t xml:space="preserve">Panel general y resumen del cultivo con el rango ideal</w:t>
-            </w:r>
-          </w:p>
-        </w:tc>
-        <w:tc>
-          <w:tcPr>
-            <w:tcW w:w="3191" w:type="dxa"/>
-            <w:shd w:val="clear" w:color="auto" w:fill="FFFFFF"/>
-            <w:tcMar>
-              <w:top w:w="70" w:type="dxa"/>
-              <w:left w:w="110" w:type="dxa"/>
-              <w:bottom w:w="70" w:type="dxa"/>
-              <w:right w:w="110" w:type="dxa"/>
-            </w:tcMar>
-            <w:vAlign w:val="center"/>
-          </w:tcPr>
-          <w:p>
-            <w:pPr>
-              <w:spacing w:before="0" w:after="0" w:line="252" w:lineRule="auto"/>
-            </w:pPr>
-            <w:r>
-              <w:rPr>
-                <w:color w:val="17261F"/>
-                <w:sz w:val="17"/>
-                <w:szCs w:val="17"/>
-              </w:rPr>
-              <w:t xml:space="preserve">Sin lecturas: aviso para conectar la maceta; maceta desconectada</w:t>
+            <w:tcW w:w="2340" w:type="dxa"/>
+            <w:shd w:val="clear" w:color="auto" w:fill="FFFFFF"/>
+            <w:tcMar>
+              <w:top w:w="70" w:type="dxa"/>
+              <w:left w:w="110" w:type="dxa"/>
+              <w:bottom w:w="70" w:type="dxa"/>
+              <w:right w:w="110" w:type="dxa"/>
+            </w:tcMar>
+            <w:vAlign w:val="center"/>
+          </w:tcPr>
+          <w:p>
+            <w:pPr>
+              <w:spacing w:before="0" w:after="0" w:line="252" w:lineRule="auto"/>
+            </w:pPr>
+            <w:r>
+              <w:rPr>
+                <w:b/>
+                <w:bCs/>
+                <w:color w:val="0A5A3C"/>
+                <w:sz w:val="17"/>
+                <w:szCs w:val="17"/>
+              </w:rPr>
+              <w:t xml:space="preserve">CU003 Ver el cultivo en vivo</w:t>
+            </w:r>
+          </w:p>
+        </w:tc>
+        <w:tc>
+          <w:tcPr>
+            <w:tcW w:w="3569" w:type="dxa"/>
+            <w:shd w:val="clear" w:color="auto" w:fill="FFFFFF"/>
+            <w:tcMar>
+              <w:top w:w="70" w:type="dxa"/>
+              <w:left w:w="110" w:type="dxa"/>
+              <w:bottom w:w="70" w:type="dxa"/>
+              <w:right w:w="110" w:type="dxa"/>
+            </w:tcMar>
+            <w:vAlign w:val="center"/>
+          </w:tcPr>
+          <w:p>
+            <w:pPr>
+              <w:spacing w:before="0" w:after="0" w:line="252" w:lineRule="auto"/>
+            </w:pPr>
+            <w:r>
+              <w:rPr>
+                <w:color w:val="17261F"/>
+                <w:sz w:val="17"/>
+                <w:szCs w:val="17"/>
+              </w:rPr>
+              <w:t xml:space="preserve">Panel general, resumen con el rango ideal e ilustración del cultivo con su forma y cada actuador</w:t>
+            </w:r>
+          </w:p>
+        </w:tc>
+        <w:tc>
+          <w:tcPr>
+            <w:tcW w:w="3451" w:type="dxa"/>
+            <w:shd w:val="clear" w:color="auto" w:fill="FFFFFF"/>
+            <w:tcMar>
+              <w:top w:w="70" w:type="dxa"/>
+              <w:left w:w="110" w:type="dxa"/>
+              <w:bottom w:w="70" w:type="dxa"/>
+              <w:right w:w="110" w:type="dxa"/>
+            </w:tcMar>
+            <w:vAlign w:val="center"/>
+          </w:tcPr>
+          <w:p>
+            <w:pPr>
+              <w:spacing w:before="0" w:after="0" w:line="252" w:lineRule="auto"/>
+            </w:pPr>
+            <w:r>
+              <w:rPr>
+                <w:color w:val="17261F"/>
+                <w:sz w:val="17"/>
+                <w:szCs w:val="17"/>
+              </w:rPr>
+              <w:t xml:space="preserve">Sin lecturas: aviso para conectarlo; desconectado: no se ilustra y se explica cómo conectarlo</w:t>
             </w:r>
           </w:p>
         </w:tc>
@@ -11048,7 +11065,7 @@
         </w:trPr>
         <w:tc>
           <w:tcPr>
-            <w:tcW w:w="2375" w:type="dxa"/>
+            <w:tcW w:w="2340" w:type="dxa"/>
             <w:shd w:val="clear" w:color="auto" w:fill="F2F7F4"/>
             <w:tcMar>
               <w:top w:w="70" w:type="dxa"/>
@@ -11076,7 +11093,7 @@
         </w:tc>
         <w:tc>
           <w:tcPr>
-            <w:tcW w:w="3794" w:type="dxa"/>
+            <w:tcW w:w="3569" w:type="dxa"/>
             <w:shd w:val="clear" w:color="auto" w:fill="F2F7F4"/>
             <w:tcMar>
               <w:top w:w="70" w:type="dxa"/>
@@ -11102,7 +11119,7 @@
         </w:tc>
         <w:tc>
           <w:tcPr>
-            <w:tcW w:w="3191" w:type="dxa"/>
+            <w:tcW w:w="3451" w:type="dxa"/>
             <w:shd w:val="clear" w:color="auto" w:fill="F2F7F4"/>
             <w:tcMar>
               <w:top w:w="70" w:type="dxa"/>
@@ -11133,7 +11150,7 @@
         </w:trPr>
         <w:tc>
           <w:tcPr>
-            <w:tcW w:w="2375" w:type="dxa"/>
+            <w:tcW w:w="2340" w:type="dxa"/>
             <w:shd w:val="clear" w:color="auto" w:fill="FFFFFF"/>
             <w:tcMar>
               <w:top w:w="70" w:type="dxa"/>
@@ -11161,7 +11178,7 @@
         </w:tc>
         <w:tc>
           <w:tcPr>
-            <w:tcW w:w="3794" w:type="dxa"/>
+            <w:tcW w:w="3569" w:type="dxa"/>
             <w:shd w:val="clear" w:color="auto" w:fill="FFFFFF"/>
             <w:tcMar>
               <w:top w:w="70" w:type="dxa"/>
@@ -11187,7 +11204,7 @@
         </w:tc>
         <w:tc>
           <w:tcPr>
-            <w:tcW w:w="3191" w:type="dxa"/>
+            <w:tcW w:w="3451" w:type="dxa"/>
             <w:shd w:val="clear" w:color="auto" w:fill="FFFFFF"/>
             <w:tcMar>
               <w:top w:w="70" w:type="dxa"/>
@@ -11218,7 +11235,7 @@
         </w:trPr>
         <w:tc>
           <w:tcPr>
-            <w:tcW w:w="2375" w:type="dxa"/>
+            <w:tcW w:w="2340" w:type="dxa"/>
             <w:shd w:val="clear" w:color="auto" w:fill="F2F7F4"/>
             <w:tcMar>
               <w:top w:w="70" w:type="dxa"/>
@@ -11246,7 +11263,7 @@
         </w:tc>
         <w:tc>
           <w:tcPr>
-            <w:tcW w:w="3794" w:type="dxa"/>
+            <w:tcW w:w="3569" w:type="dxa"/>
             <w:shd w:val="clear" w:color="auto" w:fill="F2F7F4"/>
             <w:tcMar>
               <w:top w:w="70" w:type="dxa"/>
@@ -11272,7 +11289,7 @@
         </w:tc>
         <w:tc>
           <w:tcPr>
-            <w:tcW w:w="3191" w:type="dxa"/>
+            <w:tcW w:w="3451" w:type="dxa"/>
             <w:shd w:val="clear" w:color="auto" w:fill="F2F7F4"/>
             <w:tcMar>
               <w:top w:w="70" w:type="dxa"/>
@@ -11303,81 +11320,81 @@
         </w:trPr>
         <w:tc>
           <w:tcPr>
-            <w:tcW w:w="2375" w:type="dxa"/>
-            <w:shd w:val="clear" w:color="auto" w:fill="FFFFFF"/>
-            <w:tcMar>
-              <w:top w:w="70" w:type="dxa"/>
-              <w:left w:w="110" w:type="dxa"/>
-              <w:bottom w:w="70" w:type="dxa"/>
-              <w:right w:w="110" w:type="dxa"/>
-            </w:tcMar>
-            <w:vAlign w:val="center"/>
-          </w:tcPr>
-          <w:p>
-            <w:pPr>
-              <w:spacing w:before="0" w:after="0" w:line="252" w:lineRule="auto"/>
-            </w:pPr>
-            <w:r>
-              <w:rPr>
-                <w:b/>
-                <w:bCs/>
-                <w:color w:val="0A5A3C"/>
-                <w:sz w:val="17"/>
-                <w:szCs w:val="17"/>
-              </w:rPr>
-              <w:t xml:space="preserve">CU007 Configurar el cultivo</w:t>
-            </w:r>
-          </w:p>
-        </w:tc>
-        <w:tc>
-          <w:tcPr>
-            <w:tcW w:w="3794" w:type="dxa"/>
-            <w:shd w:val="clear" w:color="auto" w:fill="FFFFFF"/>
-            <w:tcMar>
-              <w:top w:w="70" w:type="dxa"/>
-              <w:left w:w="110" w:type="dxa"/>
-              <w:bottom w:w="70" w:type="dxa"/>
-              <w:right w:w="110" w:type="dxa"/>
-            </w:tcMar>
-            <w:vAlign w:val="center"/>
-          </w:tcPr>
-          <w:p>
-            <w:pPr>
-              <w:spacing w:before="0" w:after="0" w:line="252" w:lineRule="auto"/>
-            </w:pPr>
-            <w:r>
-              <w:rPr>
-                <w:color w:val="17261F"/>
-                <w:sz w:val="17"/>
-                <w:szCs w:val="17"/>
-              </w:rPr>
-              <w:t xml:space="preserve">Nombre, especie y modo automático</w:t>
-            </w:r>
-          </w:p>
-        </w:tc>
-        <w:tc>
-          <w:tcPr>
-            <w:tcW w:w="3191" w:type="dxa"/>
-            <w:shd w:val="clear" w:color="auto" w:fill="FFFFFF"/>
-            <w:tcMar>
-              <w:top w:w="70" w:type="dxa"/>
-              <w:left w:w="110" w:type="dxa"/>
-              <w:bottom w:w="70" w:type="dxa"/>
-              <w:right w:w="110" w:type="dxa"/>
-            </w:tcMar>
-            <w:vAlign w:val="center"/>
-          </w:tcPr>
-          <w:p>
-            <w:pPr>
-              <w:spacing w:before="0" w:after="0" w:line="252" w:lineRule="auto"/>
-            </w:pPr>
-            <w:r>
-              <w:rPr>
-                <w:color w:val="17261F"/>
-                <w:sz w:val="17"/>
-                <w:szCs w:val="17"/>
-              </w:rPr>
-              <w:t xml:space="preserve">Validación de campos en español</w:t>
+            <w:tcW w:w="2340" w:type="dxa"/>
+            <w:shd w:val="clear" w:color="auto" w:fill="FFFFFF"/>
+            <w:tcMar>
+              <w:top w:w="70" w:type="dxa"/>
+              <w:left w:w="110" w:type="dxa"/>
+              <w:bottom w:w="70" w:type="dxa"/>
+              <w:right w:w="110" w:type="dxa"/>
+            </w:tcMar>
+            <w:vAlign w:val="center"/>
+          </w:tcPr>
+          <w:p>
+            <w:pPr>
+              <w:spacing w:before="0" w:after="0" w:line="252" w:lineRule="auto"/>
+            </w:pPr>
+            <w:r>
+              <w:rPr>
+                <w:b/>
+                <w:bCs/>
+                <w:color w:val="0A5A3C"/>
+                <w:sz w:val="17"/>
+                <w:szCs w:val="17"/>
+              </w:rPr>
+              <w:t xml:space="preserve">CU007 Crear y configurar el cultivo</w:t>
+            </w:r>
+          </w:p>
+        </w:tc>
+        <w:tc>
+          <w:tcPr>
+            <w:tcW w:w="3569" w:type="dxa"/>
+            <w:shd w:val="clear" w:color="auto" w:fill="FFFFFF"/>
+            <w:tcMar>
+              <w:top w:w="70" w:type="dxa"/>
+              <w:left w:w="110" w:type="dxa"/>
+              <w:bottom w:w="70" w:type="dxa"/>
+              <w:right w:w="110" w:type="dxa"/>
+            </w:tcMar>
+            <w:vAlign w:val="center"/>
+          </w:tcPr>
+          <w:p>
+            <w:pPr>
+              <w:spacing w:before="0" w:after="0" w:line="252" w:lineRule="auto"/>
+            </w:pPr>
+            <w:r>
+              <w:rPr>
+                <w:color w:val="17261F"/>
+                <w:sz w:val="17"/>
+                <w:szCs w:val="17"/>
+              </w:rPr>
+              <w:t xml:space="preserve">Real o virtual (no cambia después), nombre, especie, forma y modo automático</w:t>
+            </w:r>
+          </w:p>
+        </w:tc>
+        <w:tc>
+          <w:tcPr>
+            <w:tcW w:w="3451" w:type="dxa"/>
+            <w:shd w:val="clear" w:color="auto" w:fill="FFFFFF"/>
+            <w:tcMar>
+              <w:top w:w="70" w:type="dxa"/>
+              <w:left w:w="110" w:type="dxa"/>
+              <w:bottom w:w="70" w:type="dxa"/>
+              <w:right w:w="110" w:type="dxa"/>
+            </w:tcMar>
+            <w:vAlign w:val="center"/>
+          </w:tcPr>
+          <w:p>
+            <w:pPr>
+              <w:spacing w:before="0" w:after="0" w:line="252" w:lineRule="auto"/>
+            </w:pPr>
+            <w:r>
+              <w:rPr>
+                <w:color w:val="17261F"/>
+                <w:sz w:val="17"/>
+                <w:szCs w:val="17"/>
+              </w:rPr>
+              <w:t xml:space="preserve">Validación de campos en español; cambiar el tipo se rechaza</w:t>
             </w:r>
           </w:p>
         </w:tc>
@@ -11388,7 +11405,7 @@
         </w:trPr>
         <w:tc>
           <w:tcPr>
-            <w:tcW w:w="2375" w:type="dxa"/>
+            <w:tcW w:w="2340" w:type="dxa"/>
             <w:shd w:val="clear" w:color="auto" w:fill="F2F7F4"/>
             <w:tcMar>
               <w:top w:w="70" w:type="dxa"/>
@@ -11416,7 +11433,7 @@
         </w:tc>
         <w:tc>
           <w:tcPr>
-            <w:tcW w:w="3794" w:type="dxa"/>
+            <w:tcW w:w="3569" w:type="dxa"/>
             <w:shd w:val="clear" w:color="auto" w:fill="F2F7F4"/>
             <w:tcMar>
               <w:top w:w="70" w:type="dxa"/>
@@ -11442,7 +11459,7 @@
         </w:tc>
         <w:tc>
           <w:tcPr>
-            <w:tcW w:w="3191" w:type="dxa"/>
+            <w:tcW w:w="3451" w:type="dxa"/>
             <w:shd w:val="clear" w:color="auto" w:fill="F2F7F4"/>
             <w:tcMar>
               <w:top w:w="70" w:type="dxa"/>
@@ -11473,7 +11490,7 @@
         </w:trPr>
         <w:tc>
           <w:tcPr>
-            <w:tcW w:w="2375" w:type="dxa"/>
+            <w:tcW w:w="2340" w:type="dxa"/>
             <w:shd w:val="clear" w:color="auto" w:fill="FFFFFF"/>
             <w:tcMar>
               <w:top w:w="70" w:type="dxa"/>
@@ -11501,7 +11518,7 @@
         </w:tc>
         <w:tc>
           <w:tcPr>
-            <w:tcW w:w="3794" w:type="dxa"/>
+            <w:tcW w:w="3569" w:type="dxa"/>
             <w:shd w:val="clear" w:color="auto" w:fill="FFFFFF"/>
             <w:tcMar>
               <w:top w:w="70" w:type="dxa"/>
@@ -11527,27 +11544,27 @@
         </w:tc>
         <w:tc>
           <w:tcPr>
-            <w:tcW w:w="3191" w:type="dxa"/>
-            <w:shd w:val="clear" w:color="auto" w:fill="FFFFFF"/>
-            <w:tcMar>
-              <w:top w:w="70" w:type="dxa"/>
-              <w:left w:w="110" w:type="dxa"/>
-              <w:bottom w:w="70" w:type="dxa"/>
-              <w:right w:w="110" w:type="dxa"/>
-            </w:tcMar>
-            <w:vAlign w:val="center"/>
-          </w:tcPr>
-          <w:p>
-            <w:pPr>
-              <w:spacing w:before="0" w:after="0" w:line="252" w:lineRule="auto"/>
-            </w:pPr>
-            <w:r>
-              <w:rPr>
-                <w:color w:val="17261F"/>
-                <w:sz w:val="17"/>
-                <w:szCs w:val="17"/>
-              </w:rPr>
-              <w:t xml:space="preserve">Maceta sin ese actuador: se informa por cultivo</w:t>
+            <w:tcW w:w="3451" w:type="dxa"/>
+            <w:shd w:val="clear" w:color="auto" w:fill="FFFFFF"/>
+            <w:tcMar>
+              <w:top w:w="70" w:type="dxa"/>
+              <w:left w:w="110" w:type="dxa"/>
+              <w:bottom w:w="70" w:type="dxa"/>
+              <w:right w:w="110" w:type="dxa"/>
+            </w:tcMar>
+            <w:vAlign w:val="center"/>
+          </w:tcPr>
+          <w:p>
+            <w:pPr>
+              <w:spacing w:before="0" w:after="0" w:line="252" w:lineRule="auto"/>
+            </w:pPr>
+            <w:r>
+              <w:rPr>
+                <w:color w:val="17261F"/>
+                <w:sz w:val="17"/>
+                <w:szCs w:val="17"/>
+              </w:rPr>
+              <w:t xml:space="preserve">Cultivo sin ese actuador: se informa por cultivo</w:t>
             </w:r>
           </w:p>
         </w:tc>
@@ -11558,81 +11575,81 @@
         </w:trPr>
         <w:tc>
           <w:tcPr>
-            <w:tcW w:w="2375" w:type="dxa"/>
-            <w:shd w:val="clear" w:color="auto" w:fill="F2F7F4"/>
-            <w:tcMar>
-              <w:top w:w="70" w:type="dxa"/>
-              <w:left w:w="110" w:type="dxa"/>
-              <w:bottom w:w="70" w:type="dxa"/>
-              <w:right w:w="110" w:type="dxa"/>
-            </w:tcMar>
-            <w:vAlign w:val="center"/>
-          </w:tcPr>
-          <w:p>
-            <w:pPr>
-              <w:spacing w:before="0" w:after="0" w:line="252" w:lineRule="auto"/>
-            </w:pPr>
-            <w:r>
-              <w:rPr>
-                <w:b/>
-                <w:bCs/>
-                <w:color w:val="0A5A3C"/>
-                <w:sz w:val="17"/>
-                <w:szCs w:val="17"/>
-              </w:rPr>
-              <w:t xml:space="preserve">CU010 Encender una maceta virtual</w:t>
-            </w:r>
-          </w:p>
-        </w:tc>
-        <w:tc>
-          <w:tcPr>
-            <w:tcW w:w="3794" w:type="dxa"/>
-            <w:shd w:val="clear" w:color="auto" w:fill="F2F7F4"/>
-            <w:tcMar>
-              <w:top w:w="70" w:type="dxa"/>
-              <w:left w:w="110" w:type="dxa"/>
-              <w:bottom w:w="70" w:type="dxa"/>
-              <w:right w:w="110" w:type="dxa"/>
-            </w:tcMar>
-            <w:vAlign w:val="center"/>
-          </w:tcPr>
-          <w:p>
-            <w:pPr>
-              <w:spacing w:before="0" w:after="0" w:line="252" w:lineRule="auto"/>
-            </w:pPr>
-            <w:r>
-              <w:rPr>
-                <w:color w:val="17261F"/>
-                <w:sz w:val="17"/>
-                <w:szCs w:val="17"/>
-              </w:rPr>
-              <w:t xml:space="preserve">Clima real de un lugar, medidores manuales o día y noche</w:t>
-            </w:r>
-          </w:p>
-        </w:tc>
-        <w:tc>
-          <w:tcPr>
-            <w:tcW w:w="3191" w:type="dxa"/>
-            <w:shd w:val="clear" w:color="auto" w:fill="F2F7F4"/>
-            <w:tcMar>
-              <w:top w:w="70" w:type="dxa"/>
-              <w:left w:w="110" w:type="dxa"/>
-              <w:bottom w:w="70" w:type="dxa"/>
-              <w:right w:w="110" w:type="dxa"/>
-            </w:tcMar>
-            <w:vAlign w:val="center"/>
-          </w:tcPr>
-          <w:p>
-            <w:pPr>
-              <w:spacing w:before="0" w:after="0" w:line="252" w:lineRule="auto"/>
-            </w:pPr>
-            <w:r>
-              <w:rPr>
-                <w:color w:val="17261F"/>
-                <w:sz w:val="17"/>
-                <w:szCs w:val="17"/>
-              </w:rPr>
-              <w:t xml:space="preserve">Sin ubicación en modo clima; límite de 5 por cuenta</w:t>
+            <w:tcW w:w="2340" w:type="dxa"/>
+            <w:shd w:val="clear" w:color="auto" w:fill="F2F7F4"/>
+            <w:tcMar>
+              <w:top w:w="70" w:type="dxa"/>
+              <w:left w:w="110" w:type="dxa"/>
+              <w:bottom w:w="70" w:type="dxa"/>
+              <w:right w:w="110" w:type="dxa"/>
+            </w:tcMar>
+            <w:vAlign w:val="center"/>
+          </w:tcPr>
+          <w:p>
+            <w:pPr>
+              <w:spacing w:before="0" w:after="0" w:line="252" w:lineRule="auto"/>
+            </w:pPr>
+            <w:r>
+              <w:rPr>
+                <w:b/>
+                <w:bCs/>
+                <w:color w:val="0A5A3C"/>
+                <w:sz w:val="17"/>
+                <w:szCs w:val="17"/>
+              </w:rPr>
+              <w:t xml:space="preserve">CU010 Simular un cultivo virtual</w:t>
+            </w:r>
+          </w:p>
+        </w:tc>
+        <w:tc>
+          <w:tcPr>
+            <w:tcW w:w="3569" w:type="dxa"/>
+            <w:shd w:val="clear" w:color="auto" w:fill="F2F7F4"/>
+            <w:tcMar>
+              <w:top w:w="70" w:type="dxa"/>
+              <w:left w:w="110" w:type="dxa"/>
+              <w:bottom w:w="70" w:type="dxa"/>
+              <w:right w:w="110" w:type="dxa"/>
+            </w:tcMar>
+            <w:vAlign w:val="center"/>
+          </w:tcPr>
+          <w:p>
+            <w:pPr>
+              <w:spacing w:before="0" w:after="0" w:line="252" w:lineRule="auto"/>
+            </w:pPr>
+            <w:r>
+              <w:rPr>
+                <w:color w:val="17261F"/>
+                <w:sz w:val="17"/>
+                <w:szCs w:val="17"/>
+              </w:rPr>
+              <w:t xml:space="preserve">Crearlo virtual con clima real de un lugar, medidores manuales o día y noche; pausarlo y reanudarlo</w:t>
+            </w:r>
+          </w:p>
+        </w:tc>
+        <w:tc>
+          <w:tcPr>
+            <w:tcW w:w="3451" w:type="dxa"/>
+            <w:shd w:val="clear" w:color="auto" w:fill="F2F7F4"/>
+            <w:tcMar>
+              <w:top w:w="70" w:type="dxa"/>
+              <w:left w:w="110" w:type="dxa"/>
+              <w:bottom w:w="70" w:type="dxa"/>
+              <w:right w:w="110" w:type="dxa"/>
+            </w:tcMar>
+            <w:vAlign w:val="center"/>
+          </w:tcPr>
+          <w:p>
+            <w:pPr>
+              <w:spacing w:before="0" w:after="0" w:line="252" w:lineRule="auto"/>
+            </w:pPr>
+            <w:r>
+              <w:rPr>
+                <w:color w:val="17261F"/>
+                <w:sz w:val="17"/>
+                <w:szCs w:val="17"/>
+              </w:rPr>
+              <w:t xml:space="preserve">Sin ubicación en modo clima; límite de 5 por cuenta; no entrega credenciales</w:t>
             </w:r>
           </w:p>
         </w:tc>
@@ -11643,7 +11660,7 @@
         </w:trPr>
         <w:tc>
           <w:tcPr>
-            <w:tcW w:w="2375" w:type="dxa"/>
+            <w:tcW w:w="2340" w:type="dxa"/>
             <w:shd w:val="clear" w:color="auto" w:fill="FFFFFF"/>
             <w:tcMar>
               <w:top w:w="70" w:type="dxa"/>
@@ -11671,7 +11688,7 @@
         </w:tc>
         <w:tc>
           <w:tcPr>
-            <w:tcW w:w="3794" w:type="dxa"/>
+            <w:tcW w:w="3569" w:type="dxa"/>
             <w:shd w:val="clear" w:color="auto" w:fill="FFFFFF"/>
             <w:tcMar>
               <w:top w:w="70" w:type="dxa"/>
@@ -11714,7 +11731,7 @@
         </w:tc>
         <w:tc>
           <w:tcPr>
-            <w:tcW w:w="3191" w:type="dxa"/>
+            <w:tcW w:w="3451" w:type="dxa"/>
             <w:shd w:val="clear" w:color="auto" w:fill="FFFFFF"/>
             <w:tcMar>
               <w:top w:w="70" w:type="dxa"/>
@@ -11745,7 +11762,7 @@
         </w:trPr>
         <w:tc>
           <w:tcPr>
-            <w:tcW w:w="2375" w:type="dxa"/>
+            <w:tcW w:w="2340" w:type="dxa"/>
             <w:shd w:val="clear" w:color="auto" w:fill="F2F7F4"/>
             <w:tcMar>
               <w:top w:w="70" w:type="dxa"/>
@@ -11773,7 +11790,7 @@
         </w:tc>
         <w:tc>
           <w:tcPr>
-            <w:tcW w:w="3794" w:type="dxa"/>
+            <w:tcW w:w="3569" w:type="dxa"/>
             <w:shd w:val="clear" w:color="auto" w:fill="F2F7F4"/>
             <w:tcMar>
               <w:top w:w="70" w:type="dxa"/>
@@ -11799,7 +11816,7 @@
         </w:tc>
         <w:tc>
           <w:tcPr>
-            <w:tcW w:w="3191" w:type="dxa"/>
+            <w:tcW w:w="3451" w:type="dxa"/>
             <w:shd w:val="clear" w:color="auto" w:fill="F2F7F4"/>
             <w:tcMar>
               <w:top w:w="70" w:type="dxa"/>
@@ -11908,9 +11925,9 @@
         <w:tblLook w:val="04A0" w:firstRow="1" w:firstColumn="1" w:noVBand="1"/>
       </w:tblPr>
       <w:tblGrid>
-        <w:gridCol w:w="1606"/>
-        <w:gridCol w:w="3202"/>
-        <w:gridCol w:w="4552"/>
+        <w:gridCol w:w="1644"/>
+        <w:gridCol w:w="3374"/>
+        <w:gridCol w:w="4342"/>
       </w:tblGrid>
       <w:tr>
         <w:trPr>
@@ -11919,7 +11936,7 @@
         </w:trPr>
         <w:tc>
           <w:tcPr>
-            <w:tcW w:w="1606" w:type="dxa"/>
+            <w:tcW w:w="1644" w:type="dxa"/>
             <w:shd w:val="clear" w:color="auto" w:fill="0B3D2B"/>
             <w:tcMar>
               <w:top w:w="70" w:type="dxa"/>
@@ -11948,7 +11965,7 @@
         </w:tc>
         <w:tc>
           <w:tcPr>
-            <w:tcW w:w="3202" w:type="dxa"/>
+            <w:tcW w:w="3374" w:type="dxa"/>
             <w:shd w:val="clear" w:color="auto" w:fill="0B3D2B"/>
             <w:tcMar>
               <w:top w:w="70" w:type="dxa"/>
@@ -11977,7 +11994,7 @@
         </w:tc>
         <w:tc>
           <w:tcPr>
-            <w:tcW w:w="4552" w:type="dxa"/>
+            <w:tcW w:w="4342" w:type="dxa"/>
             <w:shd w:val="clear" w:color="auto" w:fill="0B3D2B"/>
             <w:tcMar>
               <w:top w:w="70" w:type="dxa"/>
@@ -12011,7 +12028,7 @@
         </w:trPr>
         <w:tc>
           <w:tcPr>
-            <w:tcW w:w="1606" w:type="dxa"/>
+            <w:tcW w:w="1644" w:type="dxa"/>
             <w:shd w:val="clear" w:color="auto" w:fill="FFFFFF"/>
             <w:tcMar>
               <w:top w:w="70" w:type="dxa"/>
@@ -12039,7 +12056,7 @@
         </w:tc>
         <w:tc>
           <w:tcPr>
-            <w:tcW w:w="3202" w:type="dxa"/>
+            <w:tcW w:w="3374" w:type="dxa"/>
             <w:shd w:val="clear" w:color="auto" w:fill="FFFFFF"/>
             <w:tcMar>
               <w:top w:w="70" w:type="dxa"/>
@@ -12065,7 +12082,7 @@
         </w:tc>
         <w:tc>
           <w:tcPr>
-            <w:tcW w:w="4552" w:type="dxa"/>
+            <w:tcW w:w="4342" w:type="dxa"/>
             <w:shd w:val="clear" w:color="auto" w:fill="FFFFFF"/>
             <w:tcMar>
               <w:top w:w="70" w:type="dxa"/>
@@ -12096,7 +12113,7 @@
         </w:trPr>
         <w:tc>
           <w:tcPr>
-            <w:tcW w:w="1606" w:type="dxa"/>
+            <w:tcW w:w="1644" w:type="dxa"/>
             <w:shd w:val="clear" w:color="auto" w:fill="F2F7F4"/>
             <w:tcMar>
               <w:top w:w="70" w:type="dxa"/>
@@ -12124,7 +12141,7 @@
         </w:tc>
         <w:tc>
           <w:tcPr>
-            <w:tcW w:w="3202" w:type="dxa"/>
+            <w:tcW w:w="3374" w:type="dxa"/>
             <w:shd w:val="clear" w:color="auto" w:fill="F2F7F4"/>
             <w:tcMar>
               <w:top w:w="70" w:type="dxa"/>
@@ -12150,7 +12167,7 @@
         </w:tc>
         <w:tc>
           <w:tcPr>
-            <w:tcW w:w="4552" w:type="dxa"/>
+            <w:tcW w:w="4342" w:type="dxa"/>
             <w:shd w:val="clear" w:color="auto" w:fill="F2F7F4"/>
             <w:tcMar>
               <w:top w:w="70" w:type="dxa"/>
@@ -12181,7 +12198,7 @@
         </w:trPr>
         <w:tc>
           <w:tcPr>
-            <w:tcW w:w="1606" w:type="dxa"/>
+            <w:tcW w:w="1644" w:type="dxa"/>
             <w:shd w:val="clear" w:color="auto" w:fill="FFFFFF"/>
             <w:tcMar>
               <w:top w:w="70" w:type="dxa"/>
@@ -12209,7 +12226,7 @@
         </w:tc>
         <w:tc>
           <w:tcPr>
-            <w:tcW w:w="3202" w:type="dxa"/>
+            <w:tcW w:w="3374" w:type="dxa"/>
             <w:shd w:val="clear" w:color="auto" w:fill="FFFFFF"/>
             <w:tcMar>
               <w:top w:w="70" w:type="dxa"/>
@@ -12235,7 +12252,7 @@
         </w:tc>
         <w:tc>
           <w:tcPr>
-            <w:tcW w:w="4552" w:type="dxa"/>
+            <w:tcW w:w="4342" w:type="dxa"/>
             <w:shd w:val="clear" w:color="auto" w:fill="FFFFFF"/>
             <w:tcMar>
               <w:top w:w="70" w:type="dxa"/>
@@ -12266,7 +12283,7 @@
         </w:trPr>
         <w:tc>
           <w:tcPr>
-            <w:tcW w:w="1606" w:type="dxa"/>
+            <w:tcW w:w="1644" w:type="dxa"/>
             <w:shd w:val="clear" w:color="auto" w:fill="F2F7F4"/>
             <w:tcMar>
               <w:top w:w="70" w:type="dxa"/>
@@ -12294,7 +12311,7 @@
         </w:tc>
         <w:tc>
           <w:tcPr>
-            <w:tcW w:w="3202" w:type="dxa"/>
+            <w:tcW w:w="3374" w:type="dxa"/>
             <w:shd w:val="clear" w:color="auto" w:fill="F2F7F4"/>
             <w:tcMar>
               <w:top w:w="70" w:type="dxa"/>
@@ -12320,7 +12337,7 @@
         </w:tc>
         <w:tc>
           <w:tcPr>
-            <w:tcW w:w="4552" w:type="dxa"/>
+            <w:tcW w:w="4342" w:type="dxa"/>
             <w:shd w:val="clear" w:color="auto" w:fill="F2F7F4"/>
             <w:tcMar>
               <w:top w:w="70" w:type="dxa"/>
@@ -12351,7 +12368,7 @@
         </w:trPr>
         <w:tc>
           <w:tcPr>
-            <w:tcW w:w="1606" w:type="dxa"/>
+            <w:tcW w:w="1644" w:type="dxa"/>
             <w:shd w:val="clear" w:color="auto" w:fill="FFFFFF"/>
             <w:tcMar>
               <w:top w:w="70" w:type="dxa"/>
@@ -12379,7 +12396,7 @@
         </w:tc>
         <w:tc>
           <w:tcPr>
-            <w:tcW w:w="3202" w:type="dxa"/>
+            <w:tcW w:w="3374" w:type="dxa"/>
             <w:shd w:val="clear" w:color="auto" w:fill="FFFFFF"/>
             <w:tcMar>
               <w:top w:w="70" w:type="dxa"/>
@@ -12405,27 +12422,27 @@
         </w:tc>
         <w:tc>
           <w:tcPr>
-            <w:tcW w:w="4552" w:type="dxa"/>
-            <w:shd w:val="clear" w:color="auto" w:fill="FFFFFF"/>
-            <w:tcMar>
-              <w:top w:w="70" w:type="dxa"/>
-              <w:left w:w="110" w:type="dxa"/>
-              <w:bottom w:w="70" w:type="dxa"/>
-              <w:right w:w="110" w:type="dxa"/>
-            </w:tcMar>
-            <w:vAlign w:val="center"/>
-          </w:tcPr>
-          <w:p>
-            <w:pPr>
-              <w:spacing w:before="0" w:after="0" w:line="252" w:lineRule="auto"/>
-            </w:pPr>
-            <w:r>
-              <w:rPr>
-                <w:color w:val="17261F"/>
-                <w:sz w:val="17"/>
-                <w:szCs w:val="17"/>
-              </w:rPr>
-              <w:t xml:space="preserve">En la escala relativa del sensor de la maceta (0 a 2000) y con descanso nocturno de 22:00 a 6:00</w:t>
+            <w:tcW w:w="4342" w:type="dxa"/>
+            <w:shd w:val="clear" w:color="auto" w:fill="FFFFFF"/>
+            <w:tcMar>
+              <w:top w:w="70" w:type="dxa"/>
+              <w:left w:w="110" w:type="dxa"/>
+              <w:bottom w:w="70" w:type="dxa"/>
+              <w:right w:w="110" w:type="dxa"/>
+            </w:tcMar>
+            <w:vAlign w:val="center"/>
+          </w:tcPr>
+          <w:p>
+            <w:pPr>
+              <w:spacing w:before="0" w:after="0" w:line="252" w:lineRule="auto"/>
+            </w:pPr>
+            <w:r>
+              <w:rPr>
+                <w:color w:val="17261F"/>
+                <w:sz w:val="17"/>
+                <w:szCs w:val="17"/>
+              </w:rPr>
+              <w:t xml:space="preserve">En la escala relativa del sensor (0 a 2000) y con descanso nocturno de 22:00 a 6:00</w:t>
             </w:r>
           </w:p>
         </w:tc>
@@ -12436,7 +12453,7 @@
         </w:trPr>
         <w:tc>
           <w:tcPr>
-            <w:tcW w:w="1606" w:type="dxa"/>
+            <w:tcW w:w="1644" w:type="dxa"/>
             <w:shd w:val="clear" w:color="auto" w:fill="F2F7F4"/>
             <w:tcMar>
               <w:top w:w="70" w:type="dxa"/>
@@ -12464,7 +12481,7 @@
         </w:tc>
         <w:tc>
           <w:tcPr>
-            <w:tcW w:w="3202" w:type="dxa"/>
+            <w:tcW w:w="3374" w:type="dxa"/>
             <w:shd w:val="clear" w:color="auto" w:fill="F2F7F4"/>
             <w:tcMar>
               <w:top w:w="70" w:type="dxa"/>
@@ -12490,7 +12507,7 @@
         </w:tc>
         <w:tc>
           <w:tcPr>
-            <w:tcW w:w="4552" w:type="dxa"/>
+            <w:tcW w:w="4342" w:type="dxa"/>
             <w:shd w:val="clear" w:color="auto" w:fill="F2F7F4"/>
             <w:tcMar>
               <w:top w:w="70" w:type="dxa"/>
@@ -12676,7 +12693,7 @@
           <w:sz w:val="20"/>
           <w:szCs w:val="20"/>
         </w:rPr>
-        <w:t xml:space="preserve">El diseño imaginó una maceta que decidía por sí misma: leía sus sensores, evaluaba la salud del cultivo y encendía los actuadores. La construcción movió esa inteligencia a la plataforma: la maceta mide, publica y obedece; la API y la IA deciden. Así una maceta barata se beneficia de todo lo que la plataforma aprende.</w:t>
+        <w:t xml:space="preserve">El diseño imaginó una maceta que decidía por sí misma: leía sus sensores, evaluaba la salud del cultivo y encendía los actuadores. La construcción movió esa inteligencia a la plataforma: el dispositivo mide, publica y obedece; la API y la IA deciden. Así un dispositivo barato se beneficia de todo lo que la plataforma aprende.</w:t>
       </w:r>
     </w:p>
     <w:p>
@@ -13997,7 +14014,7 @@
       <w:r>
         <w:drawing>
           <wp:inline distT="0" distB="0" distL="0" distR="0">
-            <wp:extent cx="5943600" cy="5361186"/>
+            <wp:extent cx="5943600" cy="6497237"/>
             <wp:docPr id="130" name="SmartPot_11_Domain_Classes"/>
             <wp:cNvGraphicFramePr>
               <a:graphicFrameLocks noChangeAspect="1"/>
@@ -14018,7 +14035,7 @@
                   <pic:spPr>
                     <a:xfrm>
                       <a:off x="0" y="0"/>
-                      <a:ext cx="5943600" cy="5361186"/>
+                      <a:ext cx="5943600" cy="6497237"/>
                     </a:xfrm>
                     <a:prstGeom prst="rect">
                       <a:avLst/>
@@ -14099,7 +14116,7 @@
       <w:r>
         <w:drawing>
           <wp:inline distT="0" distB="0" distL="0" distR="0">
-            <wp:extent cx="6757347" cy="4318000"/>
+            <wp:extent cx="6621459" cy="4318000"/>
             <wp:docPr id="132" name="SmartPot_12_Components"/>
             <wp:cNvGraphicFramePr>
               <a:graphicFrameLocks noChangeAspect="1"/>
@@ -14120,7 +14137,7 @@
                   <pic:spPr>
                     <a:xfrm>
                       <a:off x="0" y="0"/>
-                      <a:ext cx="6757347" cy="4318000"/>
+                      <a:ext cx="6621459" cy="4318000"/>
                     </a:xfrm>
                     <a:prstGeom prst="rect">
                       <a:avLst/>
@@ -14379,7 +14396,7 @@
       <w:r>
         <w:drawing>
           <wp:inline distT="0" distB="0" distL="0" distR="0">
-            <wp:extent cx="2954215" cy="7112000"/>
+            <wp:extent cx="2956674" cy="7112000"/>
             <wp:docPr id="134" name="SmartPot_13_Control_Activity"/>
             <wp:cNvGraphicFramePr>
               <a:graphicFrameLocks noChangeAspect="1"/>
@@ -14400,7 +14417,7 @@
                   <pic:spPr>
                     <a:xfrm>
                       <a:off x="0" y="0"/>
-                      <a:ext cx="2954215" cy="7112000"/>
+                      <a:ext cx="2956674" cy="7112000"/>
                     </a:xfrm>
                     <a:prstGeom prst="rect">
                       <a:avLst/>
@@ -14988,7 +15005,7 @@
                 <w:sz w:val="17"/>
                 <w:szCs w:val="17"/>
               </w:rPr>
-              <w:t xml:space="preserve">Los perfiles por especie son el estado compartido; las lecturas son el estado propio de cada maceta</w:t>
+              <w:t xml:space="preserve">Los perfiles por especie son el estado compartido; las lecturas son el estado propio de cada cultivo</w:t>
             </w:r>
           </w:p>
         </w:tc>
@@ -16095,10 +16112,10 @@
         <w:tblLook w:val="04A0" w:firstRow="1" w:firstColumn="1" w:noVBand="1"/>
       </w:tblPr>
       <w:tblGrid>
-        <w:gridCol w:w="1741"/>
-        <w:gridCol w:w="2414"/>
-        <w:gridCol w:w="2641"/>
-        <w:gridCol w:w="2564"/>
+        <w:gridCol w:w="1775"/>
+        <w:gridCol w:w="2405"/>
+        <w:gridCol w:w="2629"/>
+        <w:gridCol w:w="2551"/>
       </w:tblGrid>
       <w:tr>
         <w:trPr>
@@ -16107,7 +16124,7 @@
         </w:trPr>
         <w:tc>
           <w:tcPr>
-            <w:tcW w:w="1741" w:type="dxa"/>
+            <w:tcW w:w="1775" w:type="dxa"/>
             <w:shd w:val="clear" w:color="auto" w:fill="0B3D2B"/>
             <w:tcMar>
               <w:top w:w="70" w:type="dxa"/>
@@ -16136,7 +16153,7 @@
         </w:tc>
         <w:tc>
           <w:tcPr>
-            <w:tcW w:w="2414" w:type="dxa"/>
+            <w:tcW w:w="2405" w:type="dxa"/>
             <w:shd w:val="clear" w:color="auto" w:fill="0B3D2B"/>
             <w:tcMar>
               <w:top w:w="70" w:type="dxa"/>
@@ -16165,7 +16182,7 @@
         </w:tc>
         <w:tc>
           <w:tcPr>
-            <w:tcW w:w="2641" w:type="dxa"/>
+            <w:tcW w:w="2629" w:type="dxa"/>
             <w:shd w:val="clear" w:color="auto" w:fill="0B3D2B"/>
             <w:tcMar>
               <w:top w:w="70" w:type="dxa"/>
@@ -16194,7 +16211,7 @@
         </w:tc>
         <w:tc>
           <w:tcPr>
-            <w:tcW w:w="2564" w:type="dxa"/>
+            <w:tcW w:w="2551" w:type="dxa"/>
             <w:shd w:val="clear" w:color="auto" w:fill="0B3D2B"/>
             <w:tcMar>
               <w:top w:w="70" w:type="dxa"/>
@@ -16228,35 +16245,35 @@
         </w:trPr>
         <w:tc>
           <w:tcPr>
-            <w:tcW w:w="1741" w:type="dxa"/>
-            <w:shd w:val="clear" w:color="auto" w:fill="FFFFFF"/>
-            <w:tcMar>
-              <w:top w:w="70" w:type="dxa"/>
-              <w:left w:w="110" w:type="dxa"/>
-              <w:bottom w:w="70" w:type="dxa"/>
-              <w:right w:w="110" w:type="dxa"/>
-            </w:tcMar>
-            <w:vAlign w:val="center"/>
-          </w:tcPr>
-          <w:p>
-            <w:pPr>
-              <w:spacing w:before="0" w:after="0" w:line="252" w:lineRule="auto"/>
-            </w:pPr>
-            <w:r>
-              <w:rPr>
-                <w:b/>
-                <w:bCs/>
-                <w:color w:val="0A5A3C"/>
-                <w:sz w:val="17"/>
-                <w:szCs w:val="17"/>
-              </w:rPr>
-              <w:t xml:space="preserve">Comunicación de la maceta</w:t>
-            </w:r>
-          </w:p>
-        </w:tc>
-        <w:tc>
-          <w:tcPr>
-            <w:tcW w:w="2414" w:type="dxa"/>
+            <w:tcW w:w="1775" w:type="dxa"/>
+            <w:shd w:val="clear" w:color="auto" w:fill="FFFFFF"/>
+            <w:tcMar>
+              <w:top w:w="70" w:type="dxa"/>
+              <w:left w:w="110" w:type="dxa"/>
+              <w:bottom w:w="70" w:type="dxa"/>
+              <w:right w:w="110" w:type="dxa"/>
+            </w:tcMar>
+            <w:vAlign w:val="center"/>
+          </w:tcPr>
+          <w:p>
+            <w:pPr>
+              <w:spacing w:before="0" w:after="0" w:line="252" w:lineRule="auto"/>
+            </w:pPr>
+            <w:r>
+              <w:rPr>
+                <w:b/>
+                <w:bCs/>
+                <w:color w:val="0A5A3C"/>
+                <w:sz w:val="17"/>
+                <w:szCs w:val="17"/>
+              </w:rPr>
+              <w:t xml:space="preserve">Comunicación del dispositivo</w:t>
+            </w:r>
+          </w:p>
+        </w:tc>
+        <w:tc>
+          <w:tcPr>
+            <w:tcW w:w="2405" w:type="dxa"/>
             <w:shd w:val="clear" w:color="auto" w:fill="FFFFFF"/>
             <w:tcMar>
               <w:top w:w="70" w:type="dxa"/>
@@ -16282,7 +16299,7 @@
         </w:tc>
         <w:tc>
           <w:tcPr>
-            <w:tcW w:w="2641" w:type="dxa"/>
+            <w:tcW w:w="2629" w:type="dxa"/>
             <w:shd w:val="clear" w:color="auto" w:fill="FFFFFF"/>
             <w:tcMar>
               <w:top w:w="70" w:type="dxa"/>
@@ -16308,27 +16325,27 @@
         </w:tc>
         <w:tc>
           <w:tcPr>
-            <w:tcW w:w="2564" w:type="dxa"/>
-            <w:shd w:val="clear" w:color="auto" w:fill="FFFFFF"/>
-            <w:tcMar>
-              <w:top w:w="70" w:type="dxa"/>
-              <w:left w:w="110" w:type="dxa"/>
-              <w:bottom w:w="70" w:type="dxa"/>
-              <w:right w:w="110" w:type="dxa"/>
-            </w:tcMar>
-            <w:vAlign w:val="center"/>
-          </w:tcPr>
-          <w:p>
-            <w:pPr>
-              <w:spacing w:before="0" w:after="0" w:line="252" w:lineRule="auto"/>
-            </w:pPr>
-            <w:r>
-              <w:rPr>
-                <w:color w:val="17261F"/>
-                <w:sz w:val="17"/>
-                <w:szCs w:val="17"/>
-              </w:rPr>
-              <w:t xml:space="preserve">Conexión liviana y bidireccional, y saber si la maceta está en línea</w:t>
+            <w:tcW w:w="2551" w:type="dxa"/>
+            <w:shd w:val="clear" w:color="auto" w:fill="FFFFFF"/>
+            <w:tcMar>
+              <w:top w:w="70" w:type="dxa"/>
+              <w:left w:w="110" w:type="dxa"/>
+              <w:bottom w:w="70" w:type="dxa"/>
+              <w:right w:w="110" w:type="dxa"/>
+            </w:tcMar>
+            <w:vAlign w:val="center"/>
+          </w:tcPr>
+          <w:p>
+            <w:pPr>
+              <w:spacing w:before="0" w:after="0" w:line="252" w:lineRule="auto"/>
+            </w:pPr>
+            <w:r>
+              <w:rPr>
+                <w:color w:val="17261F"/>
+                <w:sz w:val="17"/>
+                <w:szCs w:val="17"/>
+              </w:rPr>
+              <w:t xml:space="preserve">Conexión liviana y bidireccional, y saber si el cultivo está en línea</w:t>
             </w:r>
           </w:p>
         </w:tc>
@@ -16339,7 +16356,7 @@
         </w:trPr>
         <w:tc>
           <w:tcPr>
-            <w:tcW w:w="1741" w:type="dxa"/>
+            <w:tcW w:w="1775" w:type="dxa"/>
             <w:shd w:val="clear" w:color="auto" w:fill="F2F7F4"/>
             <w:tcMar>
               <w:top w:w="70" w:type="dxa"/>
@@ -16367,7 +16384,7 @@
         </w:tc>
         <w:tc>
           <w:tcPr>
-            <w:tcW w:w="2414" w:type="dxa"/>
+            <w:tcW w:w="2405" w:type="dxa"/>
             <w:shd w:val="clear" w:color="auto" w:fill="F2F7F4"/>
             <w:tcMar>
               <w:top w:w="70" w:type="dxa"/>
@@ -16393,7 +16410,7 @@
         </w:tc>
         <w:tc>
           <w:tcPr>
-            <w:tcW w:w="2641" w:type="dxa"/>
+            <w:tcW w:w="2629" w:type="dxa"/>
             <w:shd w:val="clear" w:color="auto" w:fill="F2F7F4"/>
             <w:tcMar>
               <w:top w:w="70" w:type="dxa"/>
@@ -16436,7 +16453,7 @@
         </w:tc>
         <w:tc>
           <w:tcPr>
-            <w:tcW w:w="2564" w:type="dxa"/>
+            <w:tcW w:w="2551" w:type="dxa"/>
             <w:shd w:val="clear" w:color="auto" w:fill="F2F7F4"/>
             <w:tcMar>
               <w:top w:w="70" w:type="dxa"/>
@@ -16467,7 +16484,7 @@
         </w:trPr>
         <w:tc>
           <w:tcPr>
-            <w:tcW w:w="1741" w:type="dxa"/>
+            <w:tcW w:w="1775" w:type="dxa"/>
             <w:shd w:val="clear" w:color="auto" w:fill="FFFFFF"/>
             <w:tcMar>
               <w:top w:w="70" w:type="dxa"/>
@@ -16495,7 +16512,7 @@
         </w:tc>
         <w:tc>
           <w:tcPr>
-            <w:tcW w:w="2414" w:type="dxa"/>
+            <w:tcW w:w="2405" w:type="dxa"/>
             <w:shd w:val="clear" w:color="auto" w:fill="FFFFFF"/>
             <w:tcMar>
               <w:top w:w="70" w:type="dxa"/>
@@ -16521,7 +16538,7 @@
         </w:tc>
         <w:tc>
           <w:tcPr>
-            <w:tcW w:w="2641" w:type="dxa"/>
+            <w:tcW w:w="2629" w:type="dxa"/>
             <w:shd w:val="clear" w:color="auto" w:fill="FFFFFF"/>
             <w:tcMar>
               <w:top w:w="70" w:type="dxa"/>
@@ -16547,7 +16564,7 @@
         </w:tc>
         <w:tc>
           <w:tcPr>
-            <w:tcW w:w="2564" w:type="dxa"/>
+            <w:tcW w:w="2551" w:type="dxa"/>
             <w:shd w:val="clear" w:color="auto" w:fill="FFFFFF"/>
             <w:tcMar>
               <w:top w:w="70" w:type="dxa"/>
@@ -16578,7 +16595,7 @@
         </w:trPr>
         <w:tc>
           <w:tcPr>
-            <w:tcW w:w="1741" w:type="dxa"/>
+            <w:tcW w:w="1775" w:type="dxa"/>
             <w:shd w:val="clear" w:color="auto" w:fill="F2F7F4"/>
             <w:tcMar>
               <w:top w:w="70" w:type="dxa"/>
@@ -16606,7 +16623,7 @@
         </w:tc>
         <w:tc>
           <w:tcPr>
-            <w:tcW w:w="2414" w:type="dxa"/>
+            <w:tcW w:w="2405" w:type="dxa"/>
             <w:shd w:val="clear" w:color="auto" w:fill="F2F7F4"/>
             <w:tcMar>
               <w:top w:w="70" w:type="dxa"/>
@@ -16632,7 +16649,7 @@
         </w:tc>
         <w:tc>
           <w:tcPr>
-            <w:tcW w:w="2641" w:type="dxa"/>
+            <w:tcW w:w="2629" w:type="dxa"/>
             <w:shd w:val="clear" w:color="auto" w:fill="F2F7F4"/>
             <w:tcMar>
               <w:top w:w="70" w:type="dxa"/>
@@ -16658,7 +16675,7 @@
         </w:tc>
         <w:tc>
           <w:tcPr>
-            <w:tcW w:w="2564" w:type="dxa"/>
+            <w:tcW w:w="2551" w:type="dxa"/>
             <w:shd w:val="clear" w:color="auto" w:fill="F2F7F4"/>
             <w:tcMar>
               <w:top w:w="70" w:type="dxa"/>
@@ -16689,7 +16706,7 @@
         </w:trPr>
         <w:tc>
           <w:tcPr>
-            <w:tcW w:w="1741" w:type="dxa"/>
+            <w:tcW w:w="1775" w:type="dxa"/>
             <w:shd w:val="clear" w:color="auto" w:fill="FFFFFF"/>
             <w:tcMar>
               <w:top w:w="70" w:type="dxa"/>
@@ -16717,7 +16734,7 @@
         </w:tc>
         <w:tc>
           <w:tcPr>
-            <w:tcW w:w="2414" w:type="dxa"/>
+            <w:tcW w:w="2405" w:type="dxa"/>
             <w:shd w:val="clear" w:color="auto" w:fill="FFFFFF"/>
             <w:tcMar>
               <w:top w:w="70" w:type="dxa"/>
@@ -16743,7 +16760,7 @@
         </w:tc>
         <w:tc>
           <w:tcPr>
-            <w:tcW w:w="2641" w:type="dxa"/>
+            <w:tcW w:w="2629" w:type="dxa"/>
             <w:shd w:val="clear" w:color="auto" w:fill="FFFFFF"/>
             <w:tcMar>
               <w:top w:w="70" w:type="dxa"/>
@@ -16769,7 +16786,7 @@
         </w:tc>
         <w:tc>
           <w:tcPr>
-            <w:tcW w:w="2564" w:type="dxa"/>
+            <w:tcW w:w="2551" w:type="dxa"/>
             <w:shd w:val="clear" w:color="auto" w:fill="FFFFFF"/>
             <w:tcMar>
               <w:top w:w="70" w:type="dxa"/>
@@ -16800,7 +16817,7 @@
         </w:trPr>
         <w:tc>
           <w:tcPr>
-            <w:tcW w:w="1741" w:type="dxa"/>
+            <w:tcW w:w="1775" w:type="dxa"/>
             <w:shd w:val="clear" w:color="auto" w:fill="F2F7F4"/>
             <w:tcMar>
               <w:top w:w="70" w:type="dxa"/>
@@ -16828,7 +16845,7 @@
         </w:tc>
         <w:tc>
           <w:tcPr>
-            <w:tcW w:w="2414" w:type="dxa"/>
+            <w:tcW w:w="2405" w:type="dxa"/>
             <w:shd w:val="clear" w:color="auto" w:fill="F2F7F4"/>
             <w:tcMar>
               <w:top w:w="70" w:type="dxa"/>
@@ -16863,7 +16880,7 @@
         </w:tc>
         <w:tc>
           <w:tcPr>
-            <w:tcW w:w="2641" w:type="dxa"/>
+            <w:tcW w:w="2629" w:type="dxa"/>
             <w:shd w:val="clear" w:color="auto" w:fill="F2F7F4"/>
             <w:tcMar>
               <w:top w:w="70" w:type="dxa"/>
@@ -16889,7 +16906,7 @@
         </w:tc>
         <w:tc>
           <w:tcPr>
-            <w:tcW w:w="2564" w:type="dxa"/>
+            <w:tcW w:w="2551" w:type="dxa"/>
             <w:shd w:val="clear" w:color="auto" w:fill="F2F7F4"/>
             <w:tcMar>
               <w:top w:w="70" w:type="dxa"/>
@@ -16920,7 +16937,7 @@
         </w:trPr>
         <w:tc>
           <w:tcPr>
-            <w:tcW w:w="1741" w:type="dxa"/>
+            <w:tcW w:w="1775" w:type="dxa"/>
             <w:shd w:val="clear" w:color="auto" w:fill="FFFFFF"/>
             <w:tcMar>
               <w:top w:w="70" w:type="dxa"/>
@@ -16948,7 +16965,7 @@
         </w:tc>
         <w:tc>
           <w:tcPr>
-            <w:tcW w:w="2414" w:type="dxa"/>
+            <w:tcW w:w="2405" w:type="dxa"/>
             <w:shd w:val="clear" w:color="auto" w:fill="FFFFFF"/>
             <w:tcMar>
               <w:top w:w="70" w:type="dxa"/>
@@ -16974,7 +16991,7 @@
         </w:tc>
         <w:tc>
           <w:tcPr>
-            <w:tcW w:w="2641" w:type="dxa"/>
+            <w:tcW w:w="2629" w:type="dxa"/>
             <w:shd w:val="clear" w:color="auto" w:fill="FFFFFF"/>
             <w:tcMar>
               <w:top w:w="70" w:type="dxa"/>
@@ -17000,7 +17017,7 @@
         </w:tc>
         <w:tc>
           <w:tcPr>
-            <w:tcW w:w="2564" w:type="dxa"/>
+            <w:tcW w:w="2551" w:type="dxa"/>
             <w:shd w:val="clear" w:color="auto" w:fill="FFFFFF"/>
             <w:tcMar>
               <w:top w:w="70" w:type="dxa"/>
@@ -17031,7 +17048,7 @@
         </w:trPr>
         <w:tc>
           <w:tcPr>
-            <w:tcW w:w="1741" w:type="dxa"/>
+            <w:tcW w:w="1775" w:type="dxa"/>
             <w:shd w:val="clear" w:color="auto" w:fill="F2F7F4"/>
             <w:tcMar>
               <w:top w:w="70" w:type="dxa"/>
@@ -17059,7 +17076,7 @@
         </w:tc>
         <w:tc>
           <w:tcPr>
-            <w:tcW w:w="2414" w:type="dxa"/>
+            <w:tcW w:w="2405" w:type="dxa"/>
             <w:shd w:val="clear" w:color="auto" w:fill="F2F7F4"/>
             <w:tcMar>
               <w:top w:w="70" w:type="dxa"/>
@@ -17085,33 +17102,33 @@
         </w:tc>
         <w:tc>
           <w:tcPr>
-            <w:tcW w:w="2641" w:type="dxa"/>
-            <w:shd w:val="clear" w:color="auto" w:fill="F2F7F4"/>
-            <w:tcMar>
-              <w:top w:w="70" w:type="dxa"/>
-              <w:left w:w="110" w:type="dxa"/>
-              <w:bottom w:w="70" w:type="dxa"/>
-              <w:right w:w="110" w:type="dxa"/>
-            </w:tcMar>
-            <w:vAlign w:val="center"/>
-          </w:tcPr>
-          <w:p>
-            <w:pPr>
-              <w:spacing w:before="0" w:after="0" w:line="252" w:lineRule="auto"/>
-            </w:pPr>
-            <w:r>
-              <w:rPr>
-                <w:color w:val="17261F"/>
-                <w:sz w:val="17"/>
-                <w:szCs w:val="17"/>
-              </w:rPr>
-              <w:t xml:space="preserve">Wokwi a mano y macetas virtuales siempre encendidas con clima real</w:t>
-            </w:r>
-          </w:p>
-        </w:tc>
-        <w:tc>
-          <w:tcPr>
-            <w:tcW w:w="2564" w:type="dxa"/>
+            <w:tcW w:w="2629" w:type="dxa"/>
+            <w:shd w:val="clear" w:color="auto" w:fill="F2F7F4"/>
+            <w:tcMar>
+              <w:top w:w="70" w:type="dxa"/>
+              <w:left w:w="110" w:type="dxa"/>
+              <w:bottom w:w="70" w:type="dxa"/>
+              <w:right w:w="110" w:type="dxa"/>
+            </w:tcMar>
+            <w:vAlign w:val="center"/>
+          </w:tcPr>
+          <w:p>
+            <w:pPr>
+              <w:spacing w:before="0" w:after="0" w:line="252" w:lineRule="auto"/>
+            </w:pPr>
+            <w:r>
+              <w:rPr>
+                <w:color w:val="17261F"/>
+                <w:sz w:val="17"/>
+                <w:szCs w:val="17"/>
+              </w:rPr>
+              <w:t xml:space="preserve">Wokwi a mano (cultivo real) y cultivos virtuales siempre encendidos con clima real</w:t>
+            </w:r>
+          </w:p>
+        </w:tc>
+        <w:tc>
+          <w:tcPr>
+            <w:tcW w:w="2551" w:type="dxa"/>
             <w:shd w:val="clear" w:color="auto" w:fill="F2F7F4"/>
             <w:tcMar>
               <w:top w:w="70" w:type="dxa"/>
@@ -17142,7 +17159,7 @@
         </w:trPr>
         <w:tc>
           <w:tcPr>
-            <w:tcW w:w="1741" w:type="dxa"/>
+            <w:tcW w:w="1775" w:type="dxa"/>
             <w:shd w:val="clear" w:color="auto" w:fill="FFFFFF"/>
             <w:tcMar>
               <w:top w:w="70" w:type="dxa"/>
@@ -17170,7 +17187,7 @@
         </w:tc>
         <w:tc>
           <w:tcPr>
-            <w:tcW w:w="2414" w:type="dxa"/>
+            <w:tcW w:w="2405" w:type="dxa"/>
             <w:shd w:val="clear" w:color="auto" w:fill="FFFFFF"/>
             <w:tcMar>
               <w:top w:w="70" w:type="dxa"/>
@@ -17196,33 +17213,33 @@
         </w:tc>
         <w:tc>
           <w:tcPr>
-            <w:tcW w:w="2641" w:type="dxa"/>
-            <w:shd w:val="clear" w:color="auto" w:fill="FFFFFF"/>
-            <w:tcMar>
-              <w:top w:w="70" w:type="dxa"/>
-              <w:left w:w="110" w:type="dxa"/>
-              <w:bottom w:w="70" w:type="dxa"/>
-              <w:right w:w="110" w:type="dxa"/>
-            </w:tcMar>
-            <w:vAlign w:val="center"/>
-          </w:tcPr>
-          <w:p>
-            <w:pPr>
-              <w:spacing w:before="0" w:after="0" w:line="252" w:lineRule="auto"/>
-            </w:pPr>
-            <w:r>
-              <w:rPr>
-                <w:color w:val="17261F"/>
-                <w:sz w:val="17"/>
-                <w:szCs w:val="17"/>
-              </w:rPr>
-              <w:t xml:space="preserve">Todo lo anterior más control de dueño, cuenta MQTT por maceta, contenedores endurecidos, CodeQL y SBOM</w:t>
-            </w:r>
-          </w:p>
-        </w:tc>
-        <w:tc>
-          <w:tcPr>
-            <w:tcW w:w="2564" w:type="dxa"/>
+            <w:tcW w:w="2629" w:type="dxa"/>
+            <w:shd w:val="clear" w:color="auto" w:fill="FFFFFF"/>
+            <w:tcMar>
+              <w:top w:w="70" w:type="dxa"/>
+              <w:left w:w="110" w:type="dxa"/>
+              <w:bottom w:w="70" w:type="dxa"/>
+              <w:right w:w="110" w:type="dxa"/>
+            </w:tcMar>
+            <w:vAlign w:val="center"/>
+          </w:tcPr>
+          <w:p>
+            <w:pPr>
+              <w:spacing w:before="0" w:after="0" w:line="252" w:lineRule="auto"/>
+            </w:pPr>
+            <w:r>
+              <w:rPr>
+                <w:color w:val="17261F"/>
+                <w:sz w:val="17"/>
+                <w:szCs w:val="17"/>
+              </w:rPr>
+              <w:t xml:space="preserve">Todo lo anterior más control de dueño, cuenta MQTT por cultivo, contenedores endurecidos, CodeQL y SBOM</w:t>
+            </w:r>
+          </w:p>
+        </w:tc>
+        <w:tc>
+          <w:tcPr>
+            <w:tcW w:w="2551" w:type="dxa"/>
             <w:shd w:val="clear" w:color="auto" w:fill="FFFFFF"/>
             <w:tcMar>
               <w:top w:w="70" w:type="dxa"/>
@@ -17659,7 +17676,7 @@
                 <w:sz w:val="17"/>
                 <w:szCs w:val="17"/>
               </w:rPr>
-              <w:t xml:space="preserve">Simulador de macetas y su API de control</w:t>
+              <w:t xml:space="preserve">Simulador de los cultivos virtuales y su API de control</w:t>
             </w:r>
           </w:p>
         </w:tc>
@@ -18122,7 +18139,7 @@
           <w:sz w:val="25"/>
           <w:szCs w:val="25"/>
         </w:rPr>
-        <w:t xml:space="preserve">14.5 Simulación: Wokwi y macetas virtuales</w:t>
+        <w:t xml:space="preserve">14.5 Simulación: Wokwi y cultivos virtuales</w:t>
       </w:r>
       <w:bookmarkEnd w:id="147"/>
     </w:p>
@@ -18136,7 +18153,7 @@
           <w:sz w:val="20"/>
           <w:szCs w:val="20"/>
         </w:rPr>
-        <w:t xml:space="preserve">Wokwi fue la decisión que permitió enfocarse en el software sin hardware. Sigue siendo la forma de probar el firmware real, a mano y en el navegador. Para una demo y un QA que no dependan de una pestaña abierta, el simulador corre siempre junto a la plataforma: cada cultivo puede tener una maceta virtual con medidores manuales, con el ciclo del día o con el clima real del lugar.</w:t>
+        <w:t xml:space="preserve">Wokwi fue la decisión que permitió enfocarse en el software sin hardware. Sigue siendo la forma de probar el firmware real, a mano y en el navegador. Para una demo y un QA que no dependan de una pestaña abierta, el simulador corre siempre junto a la plataforma: un cultivo virtual sigue medidores manuales, el ciclo del día o el clima real del lugar. La primera versión encendía una «maceta virtual» sobre cualquier cultivo; la revisión separó los dos mundos: el tipo se elige al crear el cultivo y no cambia, Wokwi cuenta como cultivo real, y cada cultivo, real o virtual, se ve en vivo con su forma (maceta, tubos NFT, torre o balsa) y cada actuador.</w:t>
       </w:r>
     </w:p>
     <w:p>
@@ -18148,8 +18165,8 @@
       <w:r>
         <w:drawing>
           <wp:inline distT="0" distB="0" distL="0" distR="0">
-            <wp:extent cx="5943600" cy="3264096"/>
-            <wp:docPr id="148" name="SmartPot_15_Virtual_Pot_Sequence"/>
+            <wp:extent cx="5943600" cy="3936945"/>
+            <wp:docPr id="148" name="SmartPot_15_Virtual_Crop_Sequence"/>
             <wp:cNvGraphicFramePr>
               <a:graphicFrameLocks noChangeAspect="1"/>
             </wp:cNvGraphicFramePr>
@@ -18157,7 +18174,7 @@
               <a:graphicData uri="http://schemas.openxmlformats.org/drawingml/2006/picture">
                 <pic:pic>
                   <pic:nvPicPr>
-                    <pic:cNvPr id="148" name="SmartPot_15_Virtual_Pot_Sequence"/>
+                    <pic:cNvPr id="148" name="SmartPot_15_Virtual_Crop_Sequence"/>
                     <pic:cNvPicPr/>
                   </pic:nvPicPr>
                   <pic:blipFill>
@@ -18169,7 +18186,7 @@
                   <pic:spPr>
                     <a:xfrm>
                       <a:off x="0" y="0"/>
-                      <a:ext cx="5943600" cy="3264096"/>
+                      <a:ext cx="5943600" cy="3936945"/>
                     </a:xfrm>
                     <a:prstGeom prst="rect">
                       <a:avLst/>
@@ -18205,7 +18222,7 @@
           <w:sz w:val="16"/>
           <w:szCs w:val="16"/>
         </w:rPr>
-        <w:t xml:space="preserve">  ·  Maceta virtual con clima real</w:t>
+        <w:t xml:space="preserve">  ·  Cultivo virtual con clima real</w:t>
       </w:r>
     </w:p>
     <w:p>
@@ -18361,9 +18378,9 @@
         <w:tblLook w:val="04A0" w:firstRow="1" w:firstColumn="1" w:noVBand="1"/>
       </w:tblPr>
       <w:tblGrid>
-        <w:gridCol w:w="1702"/>
-        <w:gridCol w:w="5161"/>
-        <w:gridCol w:w="2497"/>
+        <w:gridCol w:w="1699"/>
+        <w:gridCol w:w="5173"/>
+        <w:gridCol w:w="2488"/>
       </w:tblGrid>
       <w:tr>
         <w:trPr>
@@ -18372,7 +18389,7 @@
         </w:trPr>
         <w:tc>
           <w:tcPr>
-            <w:tcW w:w="1702" w:type="dxa"/>
+            <w:tcW w:w="1699" w:type="dxa"/>
             <w:shd w:val="clear" w:color="auto" w:fill="0B3D2B"/>
             <w:tcMar>
               <w:top w:w="70" w:type="dxa"/>
@@ -18401,7 +18418,7 @@
         </w:tc>
         <w:tc>
           <w:tcPr>
-            <w:tcW w:w="5161" w:type="dxa"/>
+            <w:tcW w:w="5173" w:type="dxa"/>
             <w:shd w:val="clear" w:color="auto" w:fill="0B3D2B"/>
             <w:tcMar>
               <w:top w:w="70" w:type="dxa"/>
@@ -18430,7 +18447,7 @@
         </w:tc>
         <w:tc>
           <w:tcPr>
-            <w:tcW w:w="2497" w:type="dxa"/>
+            <w:tcW w:w="2488" w:type="dxa"/>
             <w:shd w:val="clear" w:color="auto" w:fill="0B3D2B"/>
             <w:tcMar>
               <w:top w:w="70" w:type="dxa"/>
@@ -18464,7 +18481,7 @@
         </w:trPr>
         <w:tc>
           <w:tcPr>
-            <w:tcW w:w="1702" w:type="dxa"/>
+            <w:tcW w:w="1699" w:type="dxa"/>
             <w:shd w:val="clear" w:color="auto" w:fill="FFFFFF"/>
             <w:tcMar>
               <w:top w:w="70" w:type="dxa"/>
@@ -18492,7 +18509,7 @@
         </w:tc>
         <w:tc>
           <w:tcPr>
-            <w:tcW w:w="5161" w:type="dxa"/>
+            <w:tcW w:w="5173" w:type="dxa"/>
             <w:shd w:val="clear" w:color="auto" w:fill="FFFFFF"/>
             <w:tcMar>
               <w:top w:w="70" w:type="dxa"/>
@@ -18518,7 +18535,7 @@
         </w:tc>
         <w:tc>
           <w:tcPr>
-            <w:tcW w:w="2497" w:type="dxa"/>
+            <w:tcW w:w="2488" w:type="dxa"/>
             <w:shd w:val="clear" w:color="auto" w:fill="FFFFFF"/>
             <w:tcMar>
               <w:top w:w="70" w:type="dxa"/>
@@ -18549,7 +18566,7 @@
         </w:trPr>
         <w:tc>
           <w:tcPr>
-            <w:tcW w:w="1702" w:type="dxa"/>
+            <w:tcW w:w="1699" w:type="dxa"/>
             <w:shd w:val="clear" w:color="auto" w:fill="F2F7F4"/>
             <w:tcMar>
               <w:top w:w="70" w:type="dxa"/>
@@ -18577,7 +18594,7 @@
         </w:tc>
         <w:tc>
           <w:tcPr>
-            <w:tcW w:w="5161" w:type="dxa"/>
+            <w:tcW w:w="5173" w:type="dxa"/>
             <w:shd w:val="clear" w:color="auto" w:fill="F2F7F4"/>
             <w:tcMar>
               <w:top w:w="70" w:type="dxa"/>
@@ -18603,7 +18620,7 @@
         </w:tc>
         <w:tc>
           <w:tcPr>
-            <w:tcW w:w="2497" w:type="dxa"/>
+            <w:tcW w:w="2488" w:type="dxa"/>
             <w:shd w:val="clear" w:color="auto" w:fill="F2F7F4"/>
             <w:tcMar>
               <w:top w:w="70" w:type="dxa"/>
@@ -18634,7 +18651,7 @@
         </w:trPr>
         <w:tc>
           <w:tcPr>
-            <w:tcW w:w="1702" w:type="dxa"/>
+            <w:tcW w:w="1699" w:type="dxa"/>
             <w:shd w:val="clear" w:color="auto" w:fill="FFFFFF"/>
             <w:tcMar>
               <w:top w:w="70" w:type="dxa"/>
@@ -18662,7 +18679,7 @@
         </w:tc>
         <w:tc>
           <w:tcPr>
-            <w:tcW w:w="5161" w:type="dxa"/>
+            <w:tcW w:w="5173" w:type="dxa"/>
             <w:shd w:val="clear" w:color="auto" w:fill="FFFFFF"/>
             <w:tcMar>
               <w:top w:w="70" w:type="dxa"/>
@@ -18688,7 +18705,7 @@
         </w:tc>
         <w:tc>
           <w:tcPr>
-            <w:tcW w:w="2497" w:type="dxa"/>
+            <w:tcW w:w="2488" w:type="dxa"/>
             <w:shd w:val="clear" w:color="auto" w:fill="FFFFFF"/>
             <w:tcMar>
               <w:top w:w="70" w:type="dxa"/>
@@ -18719,7 +18736,7 @@
         </w:trPr>
         <w:tc>
           <w:tcPr>
-            <w:tcW w:w="1702" w:type="dxa"/>
+            <w:tcW w:w="1699" w:type="dxa"/>
             <w:shd w:val="clear" w:color="auto" w:fill="F2F7F4"/>
             <w:tcMar>
               <w:top w:w="70" w:type="dxa"/>
@@ -18747,7 +18764,7 @@
         </w:tc>
         <w:tc>
           <w:tcPr>
-            <w:tcW w:w="5161" w:type="dxa"/>
+            <w:tcW w:w="5173" w:type="dxa"/>
             <w:shd w:val="clear" w:color="auto" w:fill="F2F7F4"/>
             <w:tcMar>
               <w:top w:w="70" w:type="dxa"/>
@@ -18773,7 +18790,7 @@
         </w:tc>
         <w:tc>
           <w:tcPr>
-            <w:tcW w:w="2497" w:type="dxa"/>
+            <w:tcW w:w="2488" w:type="dxa"/>
             <w:shd w:val="clear" w:color="auto" w:fill="F2F7F4"/>
             <w:tcMar>
               <w:top w:w="70" w:type="dxa"/>
@@ -18804,7 +18821,7 @@
         </w:trPr>
         <w:tc>
           <w:tcPr>
-            <w:tcW w:w="1702" w:type="dxa"/>
+            <w:tcW w:w="1699" w:type="dxa"/>
             <w:shd w:val="clear" w:color="auto" w:fill="FFFFFF"/>
             <w:tcMar>
               <w:top w:w="70" w:type="dxa"/>
@@ -18832,33 +18849,33 @@
         </w:tc>
         <w:tc>
           <w:tcPr>
-            <w:tcW w:w="5161" w:type="dxa"/>
-            <w:shd w:val="clear" w:color="auto" w:fill="FFFFFF"/>
-            <w:tcMar>
-              <w:top w:w="70" w:type="dxa"/>
-              <w:left w:w="110" w:type="dxa"/>
-              <w:bottom w:w="70" w:type="dxa"/>
-              <w:right w:w="110" w:type="dxa"/>
-            </w:tcMar>
-            <w:vAlign w:val="center"/>
-          </w:tcPr>
-          <w:p>
-            <w:pPr>
-              <w:spacing w:before="0" w:after="0" w:line="252" w:lineRule="auto"/>
-            </w:pPr>
-            <w:r>
-              <w:rPr>
-                <w:color w:val="17261F"/>
-                <w:sz w:val="17"/>
-                <w:szCs w:val="17"/>
-              </w:rPr>
-              <w:t xml:space="preserve">Autenticación del broker, ACL por maceta, TLS, validadores de MongoDB, Redis y SMTP</w:t>
-            </w:r>
-          </w:p>
-        </w:tc>
-        <w:tc>
-          <w:tcPr>
-            <w:tcW w:w="2497" w:type="dxa"/>
+            <w:tcW w:w="5173" w:type="dxa"/>
+            <w:shd w:val="clear" w:color="auto" w:fill="FFFFFF"/>
+            <w:tcMar>
+              <w:top w:w="70" w:type="dxa"/>
+              <w:left w:w="110" w:type="dxa"/>
+              <w:bottom w:w="70" w:type="dxa"/>
+              <w:right w:w="110" w:type="dxa"/>
+            </w:tcMar>
+            <w:vAlign w:val="center"/>
+          </w:tcPr>
+          <w:p>
+            <w:pPr>
+              <w:spacing w:before="0" w:after="0" w:line="252" w:lineRule="auto"/>
+            </w:pPr>
+            <w:r>
+              <w:rPr>
+                <w:color w:val="17261F"/>
+                <w:sz w:val="17"/>
+                <w:szCs w:val="17"/>
+              </w:rPr>
+              <w:t xml:space="preserve">Autenticación del broker, ACL por cultivo, TLS, validadores de MongoDB, Redis y SMTP</w:t>
+            </w:r>
+          </w:p>
+        </w:tc>
+        <w:tc>
+          <w:tcPr>
+            <w:tcW w:w="2488" w:type="dxa"/>
             <w:shd w:val="clear" w:color="auto" w:fill="FFFFFF"/>
             <w:tcMar>
               <w:top w:w="70" w:type="dxa"/>
@@ -18889,7 +18906,7 @@
         </w:trPr>
         <w:tc>
           <w:tcPr>
-            <w:tcW w:w="1702" w:type="dxa"/>
+            <w:tcW w:w="1699" w:type="dxa"/>
             <w:shd w:val="clear" w:color="auto" w:fill="F2F7F4"/>
             <w:tcMar>
               <w:top w:w="70" w:type="dxa"/>
@@ -18917,7 +18934,7 @@
         </w:tc>
         <w:tc>
           <w:tcPr>
-            <w:tcW w:w="5161" w:type="dxa"/>
+            <w:tcW w:w="5173" w:type="dxa"/>
             <w:shd w:val="clear" w:color="auto" w:fill="F2F7F4"/>
             <w:tcMar>
               <w:top w:w="70" w:type="dxa"/>
@@ -18943,7 +18960,7 @@
         </w:tc>
         <w:tc>
           <w:tcPr>
-            <w:tcW w:w="2497" w:type="dxa"/>
+            <w:tcW w:w="2488" w:type="dxa"/>
             <w:shd w:val="clear" w:color="auto" w:fill="F2F7F4"/>
             <w:tcMar>
               <w:top w:w="70" w:type="dxa"/>
@@ -18983,7 +19000,7 @@
         </w:trPr>
         <w:tc>
           <w:tcPr>
-            <w:tcW w:w="1702" w:type="dxa"/>
+            <w:tcW w:w="1699" w:type="dxa"/>
             <w:shd w:val="clear" w:color="auto" w:fill="FFFFFF"/>
             <w:tcMar>
               <w:top w:w="70" w:type="dxa"/>
@@ -19011,7 +19028,7 @@
         </w:tc>
         <w:tc>
           <w:tcPr>
-            <w:tcW w:w="5161" w:type="dxa"/>
+            <w:tcW w:w="5173" w:type="dxa"/>
             <w:shd w:val="clear" w:color="auto" w:fill="FFFFFF"/>
             <w:tcMar>
               <w:top w:w="70" w:type="dxa"/>
@@ -19037,7 +19054,7 @@
         </w:tc>
         <w:tc>
           <w:tcPr>
-            <w:tcW w:w="2497" w:type="dxa"/>
+            <w:tcW w:w="2488" w:type="dxa"/>
             <w:shd w:val="clear" w:color="auto" w:fill="FFFFFF"/>
             <w:tcMar>
               <w:top w:w="70" w:type="dxa"/>
@@ -19739,8 +19756,8 @@
         <w:tblLook w:val="04A0" w:firstRow="1" w:firstColumn="1" w:noVBand="1"/>
       </w:tblPr>
       <w:tblGrid>
-        <w:gridCol w:w="1294"/>
-        <w:gridCol w:w="8066"/>
+        <w:gridCol w:w="1255"/>
+        <w:gridCol w:w="8105"/>
       </w:tblGrid>
       <w:tr>
         <w:trPr>
@@ -19749,7 +19766,7 @@
         </w:trPr>
         <w:tc>
           <w:tcPr>
-            <w:tcW w:w="1294" w:type="dxa"/>
+            <w:tcW w:w="1255" w:type="dxa"/>
             <w:shd w:val="clear" w:color="auto" w:fill="0B3D2B"/>
             <w:tcMar>
               <w:top w:w="70" w:type="dxa"/>
@@ -19778,7 +19795,7 @@
         </w:tc>
         <w:tc>
           <w:tcPr>
-            <w:tcW w:w="8066" w:type="dxa"/>
+            <w:tcW w:w="8105" w:type="dxa"/>
             <w:shd w:val="clear" w:color="auto" w:fill="0B3D2B"/>
             <w:tcMar>
               <w:top w:w="70" w:type="dxa"/>
@@ -19812,7 +19829,7 @@
         </w:trPr>
         <w:tc>
           <w:tcPr>
-            <w:tcW w:w="1294" w:type="dxa"/>
+            <w:tcW w:w="1255" w:type="dxa"/>
             <w:shd w:val="clear" w:color="auto" w:fill="FFFFFF"/>
             <w:tcMar>
               <w:top w:w="70" w:type="dxa"/>
@@ -19840,7 +19857,7 @@
         </w:tc>
         <w:tc>
           <w:tcPr>
-            <w:tcW w:w="8066" w:type="dxa"/>
+            <w:tcW w:w="8105" w:type="dxa"/>
             <w:shd w:val="clear" w:color="auto" w:fill="FFFFFF"/>
             <w:tcMar>
               <w:top w:w="70" w:type="dxa"/>
@@ -19871,7 +19888,7 @@
         </w:trPr>
         <w:tc>
           <w:tcPr>
-            <w:tcW w:w="1294" w:type="dxa"/>
+            <w:tcW w:w="1255" w:type="dxa"/>
             <w:shd w:val="clear" w:color="auto" w:fill="F2F7F4"/>
             <w:tcMar>
               <w:top w:w="70" w:type="dxa"/>
@@ -19899,27 +19916,27 @@
         </w:tc>
         <w:tc>
           <w:tcPr>
-            <w:tcW w:w="8066" w:type="dxa"/>
-            <w:shd w:val="clear" w:color="auto" w:fill="F2F7F4"/>
-            <w:tcMar>
-              <w:top w:w="70" w:type="dxa"/>
-              <w:left w:w="110" w:type="dxa"/>
-              <w:bottom w:w="70" w:type="dxa"/>
-              <w:right w:w="110" w:type="dxa"/>
-            </w:tcMar>
-            <w:vAlign w:val="center"/>
-          </w:tcPr>
-          <w:p>
-            <w:pPr>
-              <w:spacing w:before="0" w:after="0" w:line="252" w:lineRule="auto"/>
-            </w:pPr>
-            <w:r>
-              <w:rPr>
-                <w:color w:val="17261F"/>
-                <w:sz w:val="17"/>
-                <w:szCs w:val="17"/>
-              </w:rPr>
-              <w:t xml:space="preserve">E2E: cultivo con credenciales, telemetría con la clave y rechazo de una clave incorrecta</w:t>
+            <w:tcW w:w="8105" w:type="dxa"/>
+            <w:shd w:val="clear" w:color="auto" w:fill="F2F7F4"/>
+            <w:tcMar>
+              <w:top w:w="70" w:type="dxa"/>
+              <w:left w:w="110" w:type="dxa"/>
+              <w:bottom w:w="70" w:type="dxa"/>
+              <w:right w:w="110" w:type="dxa"/>
+            </w:tcMar>
+            <w:vAlign w:val="center"/>
+          </w:tcPr>
+          <w:p>
+            <w:pPr>
+              <w:spacing w:before="0" w:after="0" w:line="252" w:lineRule="auto"/>
+            </w:pPr>
+            <w:r>
+              <w:rPr>
+                <w:color w:val="17261F"/>
+                <w:sz w:val="17"/>
+                <w:szCs w:val="17"/>
+              </w:rPr>
+              <w:t xml:space="preserve">E2E: cultivo real con credenciales, telemetría con la clave y rechazo de una clave incorrecta; pruebas de la guía de conexión</w:t>
             </w:r>
           </w:p>
         </w:tc>
@@ -19930,7 +19947,7 @@
         </w:trPr>
         <w:tc>
           <w:tcPr>
-            <w:tcW w:w="1294" w:type="dxa"/>
+            <w:tcW w:w="1255" w:type="dxa"/>
             <w:shd w:val="clear" w:color="auto" w:fill="FFFFFF"/>
             <w:tcMar>
               <w:top w:w="70" w:type="dxa"/>
@@ -19958,27 +19975,27 @@
         </w:tc>
         <w:tc>
           <w:tcPr>
-            <w:tcW w:w="8066" w:type="dxa"/>
-            <w:shd w:val="clear" w:color="auto" w:fill="FFFFFF"/>
-            <w:tcMar>
-              <w:top w:w="70" w:type="dxa"/>
-              <w:left w:w="110" w:type="dxa"/>
-              <w:bottom w:w="70" w:type="dxa"/>
-              <w:right w:w="110" w:type="dxa"/>
-            </w:tcMar>
-            <w:vAlign w:val="center"/>
-          </w:tcPr>
-          <w:p>
-            <w:pPr>
-              <w:spacing w:before="0" w:after="0" w:line="252" w:lineRule="auto"/>
-            </w:pPr>
-            <w:r>
-              <w:rPr>
-                <w:color w:val="17261F"/>
-                <w:sz w:val="17"/>
-                <w:szCs w:val="17"/>
-              </w:rPr>
-              <w:t xml:space="preserve">E2E: la lectura llega por MQTT y el panel general resume la cuenta</w:t>
+            <w:tcW w:w="8105" w:type="dxa"/>
+            <w:shd w:val="clear" w:color="auto" w:fill="FFFFFF"/>
+            <w:tcMar>
+              <w:top w:w="70" w:type="dxa"/>
+              <w:left w:w="110" w:type="dxa"/>
+              <w:bottom w:w="70" w:type="dxa"/>
+              <w:right w:w="110" w:type="dxa"/>
+            </w:tcMar>
+            <w:vAlign w:val="center"/>
+          </w:tcPr>
+          <w:p>
+            <w:pPr>
+              <w:spacing w:before="0" w:after="0" w:line="252" w:lineRule="auto"/>
+            </w:pPr>
+            <w:r>
+              <w:rPr>
+                <w:color w:val="17261F"/>
+                <w:sz w:val="17"/>
+                <w:szCs w:val="17"/>
+              </w:rPr>
+              <w:t xml:space="preserve">E2E: la lectura llega por MQTT y el panel general resume la cuenta; pruebas de la escena en vivo y de la conexión</w:t>
             </w:r>
           </w:p>
         </w:tc>
@@ -19989,7 +20006,7 @@
         </w:trPr>
         <w:tc>
           <w:tcPr>
-            <w:tcW w:w="1294" w:type="dxa"/>
+            <w:tcW w:w="1255" w:type="dxa"/>
             <w:shd w:val="clear" w:color="auto" w:fill="F2F7F4"/>
             <w:tcMar>
               <w:top w:w="70" w:type="dxa"/>
@@ -20017,7 +20034,7 @@
         </w:tc>
         <w:tc>
           <w:tcPr>
-            <w:tcW w:w="8066" w:type="dxa"/>
+            <w:tcW w:w="8105" w:type="dxa"/>
             <w:shd w:val="clear" w:color="auto" w:fill="F2F7F4"/>
             <w:tcMar>
               <w:top w:w="70" w:type="dxa"/>
@@ -20048,7 +20065,7 @@
         </w:trPr>
         <w:tc>
           <w:tcPr>
-            <w:tcW w:w="1294" w:type="dxa"/>
+            <w:tcW w:w="1255" w:type="dxa"/>
             <w:shd w:val="clear" w:color="auto" w:fill="FFFFFF"/>
             <w:tcMar>
               <w:top w:w="70" w:type="dxa"/>
@@ -20076,7 +20093,7 @@
         </w:tc>
         <w:tc>
           <w:tcPr>
-            <w:tcW w:w="8066" w:type="dxa"/>
+            <w:tcW w:w="8105" w:type="dxa"/>
             <w:shd w:val="clear" w:color="auto" w:fill="FFFFFF"/>
             <w:tcMar>
               <w:top w:w="70" w:type="dxa"/>
@@ -20107,7 +20124,7 @@
         </w:trPr>
         <w:tc>
           <w:tcPr>
-            <w:tcW w:w="1294" w:type="dxa"/>
+            <w:tcW w:w="1255" w:type="dxa"/>
             <w:shd w:val="clear" w:color="auto" w:fill="F2F7F4"/>
             <w:tcMar>
               <w:top w:w="70" w:type="dxa"/>
@@ -20135,7 +20152,7 @@
         </w:tc>
         <w:tc>
           <w:tcPr>
-            <w:tcW w:w="8066" w:type="dxa"/>
+            <w:tcW w:w="8105" w:type="dxa"/>
             <w:shd w:val="clear" w:color="auto" w:fill="F2F7F4"/>
             <w:tcMar>
               <w:top w:w="70" w:type="dxa"/>
@@ -20166,7 +20183,7 @@
         </w:trPr>
         <w:tc>
           <w:tcPr>
-            <w:tcW w:w="1294" w:type="dxa"/>
+            <w:tcW w:w="1255" w:type="dxa"/>
             <w:shd w:val="clear" w:color="auto" w:fill="FFFFFF"/>
             <w:tcMar>
               <w:top w:w="70" w:type="dxa"/>
@@ -20194,27 +20211,27 @@
         </w:tc>
         <w:tc>
           <w:tcPr>
-            <w:tcW w:w="8066" w:type="dxa"/>
-            <w:shd w:val="clear" w:color="auto" w:fill="FFFFFF"/>
-            <w:tcMar>
-              <w:top w:w="70" w:type="dxa"/>
-              <w:left w:w="110" w:type="dxa"/>
-              <w:bottom w:w="70" w:type="dxa"/>
-              <w:right w:w="110" w:type="dxa"/>
-            </w:tcMar>
-            <w:vAlign w:val="center"/>
-          </w:tcPr>
-          <w:p>
-            <w:pPr>
-              <w:spacing w:before="0" w:after="0" w:line="252" w:lineRule="auto"/>
-            </w:pPr>
-            <w:r>
-              <w:rPr>
-                <w:color w:val="17261F"/>
-                <w:sz w:val="17"/>
-                <w:szCs w:val="17"/>
-              </w:rPr>
-              <w:t xml:space="preserve">Pruebas de controladores y validaciones</w:t>
+            <w:tcW w:w="8105" w:type="dxa"/>
+            <w:shd w:val="clear" w:color="auto" w:fill="FFFFFF"/>
+            <w:tcMar>
+              <w:top w:w="70" w:type="dxa"/>
+              <w:left w:w="110" w:type="dxa"/>
+              <w:bottom w:w="70" w:type="dxa"/>
+              <w:right w:w="110" w:type="dxa"/>
+            </w:tcMar>
+            <w:vAlign w:val="center"/>
+          </w:tcPr>
+          <w:p>
+            <w:pPr>
+              <w:spacing w:before="0" w:after="0" w:line="252" w:lineRule="auto"/>
+            </w:pPr>
+            <w:r>
+              <w:rPr>
+                <w:color w:val="17261F"/>
+                <w:sz w:val="17"/>
+                <w:szCs w:val="17"/>
+              </w:rPr>
+              <w:t xml:space="preserve">Pruebas de controladores y validaciones; E2E: el tipo no cambia y un cultivo real no se simula</w:t>
             </w:r>
           </w:p>
         </w:tc>
@@ -20225,7 +20242,7 @@
         </w:trPr>
         <w:tc>
           <w:tcPr>
-            <w:tcW w:w="1294" w:type="dxa"/>
+            <w:tcW w:w="1255" w:type="dxa"/>
             <w:shd w:val="clear" w:color="auto" w:fill="F2F7F4"/>
             <w:tcMar>
               <w:top w:w="70" w:type="dxa"/>
@@ -20253,7 +20270,7 @@
         </w:tc>
         <w:tc>
           <w:tcPr>
-            <w:tcW w:w="8066" w:type="dxa"/>
+            <w:tcW w:w="8105" w:type="dxa"/>
             <w:shd w:val="clear" w:color="auto" w:fill="F2F7F4"/>
             <w:tcMar>
               <w:top w:w="70" w:type="dxa"/>
@@ -20284,7 +20301,7 @@
         </w:trPr>
         <w:tc>
           <w:tcPr>
-            <w:tcW w:w="1294" w:type="dxa"/>
+            <w:tcW w:w="1255" w:type="dxa"/>
             <w:shd w:val="clear" w:color="auto" w:fill="FFFFFF"/>
             <w:tcMar>
               <w:top w:w="70" w:type="dxa"/>
@@ -20312,27 +20329,27 @@
         </w:tc>
         <w:tc>
           <w:tcPr>
-            <w:tcW w:w="8066" w:type="dxa"/>
-            <w:shd w:val="clear" w:color="auto" w:fill="FFFFFF"/>
-            <w:tcMar>
-              <w:top w:w="70" w:type="dxa"/>
-              <w:left w:w="110" w:type="dxa"/>
-              <w:bottom w:w="70" w:type="dxa"/>
-              <w:right w:w="110" w:type="dxa"/>
-            </w:tcMar>
-            <w:vAlign w:val="center"/>
-          </w:tcPr>
-          <w:p>
-            <w:pPr>
-              <w:spacing w:before="0" w:after="0" w:line="252" w:lineRule="auto"/>
-            </w:pPr>
-            <w:r>
-              <w:rPr>
-                <w:color w:val="17261F"/>
-                <w:sz w:val="17"/>
-                <w:szCs w:val="17"/>
-              </w:rPr>
-              <w:t xml:space="preserve">E2E: maceta virtual manual que publica por MQTT con la clave del cultivo y su estado en vivo</w:t>
+            <w:tcW w:w="8105" w:type="dxa"/>
+            <w:shd w:val="clear" w:color="auto" w:fill="FFFFFF"/>
+            <w:tcMar>
+              <w:top w:w="70" w:type="dxa"/>
+              <w:left w:w="110" w:type="dxa"/>
+              <w:bottom w:w="70" w:type="dxa"/>
+              <w:right w:w="110" w:type="dxa"/>
+            </w:tcMar>
+            <w:vAlign w:val="center"/>
+          </w:tcPr>
+          <w:p>
+            <w:pPr>
+              <w:spacing w:before="0" w:after="0" w:line="252" w:lineRule="auto"/>
+            </w:pPr>
+            <w:r>
+              <w:rPr>
+                <w:color w:val="17261F"/>
+                <w:sz w:val="17"/>
+                <w:szCs w:val="17"/>
+              </w:rPr>
+              <w:t xml:space="preserve">E2E: cultivo virtual manual creado sin credenciales, con seis actuadores, que publica por MQTT, informa su estado y se pausa</w:t>
             </w:r>
           </w:p>
         </w:tc>
@@ -20343,7 +20360,7 @@
         </w:trPr>
         <w:tc>
           <w:tcPr>
-            <w:tcW w:w="1294" w:type="dxa"/>
+            <w:tcW w:w="1255" w:type="dxa"/>
             <w:shd w:val="clear" w:color="auto" w:fill="F2F7F4"/>
             <w:tcMar>
               <w:top w:w="70" w:type="dxa"/>
@@ -20371,7 +20388,7 @@
         </w:tc>
         <w:tc>
           <w:tcPr>
-            <w:tcW w:w="8066" w:type="dxa"/>
+            <w:tcW w:w="8105" w:type="dxa"/>
             <w:shd w:val="clear" w:color="auto" w:fill="F2F7F4"/>
             <w:tcMar>
               <w:top w:w="70" w:type="dxa"/>
@@ -20402,7 +20419,7 @@
         </w:trPr>
         <w:tc>
           <w:tcPr>
-            <w:tcW w:w="1294" w:type="dxa"/>
+            <w:tcW w:w="1255" w:type="dxa"/>
             <w:shd w:val="clear" w:color="auto" w:fill="FFFFFF"/>
             <w:tcMar>
               <w:top w:w="70" w:type="dxa"/>
@@ -20430,7 +20447,7 @@
         </w:tc>
         <w:tc>
           <w:tcPr>
-            <w:tcW w:w="8066" w:type="dxa"/>
+            <w:tcW w:w="8105" w:type="dxa"/>
             <w:shd w:val="clear" w:color="auto" w:fill="FFFFFF"/>
             <w:tcMar>
               <w:top w:w="70" w:type="dxa"/>
@@ -20491,7 +20508,7 @@
           <w:sz w:val="20"/>
           <w:szCs w:val="20"/>
         </w:rPr>
-        <w:t xml:space="preserve">Las pruebas entrenan con dos macetas simuladas durante tres días (2160 lecturas) y exigen que cada modelo supere a su línea base en el 20 % de lecturas más recientes:</w:t>
+        <w:t xml:space="preserve">Las pruebas entrenan con dos cultivos simulados durante tres días (2160 lecturas) y exigen que cada modelo supere a su línea base en el 20 % de lecturas más recientes:</w:t>
       </w:r>
     </w:p>
     <w:p>

</xml_diff>